<commit_message>
Piekdruk-meetschema uitgebreid van 7 naar 8 regio's: hallux en tenen 2-5 apart
Doorgevoerd in CLAUDE.md (beschermd feit), eCRF 24 (drukherverdeling visite 2),
en overal waar de F-Scan/Multimask-regio's vermeld of getoond worden op de site
(meetinstrumenten, index, paradise-academy, drukmeting-demo, patiënten-educatie,
studie-protocol, gezondheidseconomie, resultaten-dashboard) — inclusief de
gedeelde interactieve voetdrukkaart, die nu mediale/laterale middenvoet als
aparte zones toont i.p.v. één middenvoet-zone.
</commit_message>
<xml_diff>
--- a/(e)CRF/Per nummer/09_Meting plantaire druk - baseline.docx
+++ b/(e)CRF/Per nummer/09_Meting plantaire druk - baseline.docx
@@ -1,17 +1,17 @@
 
 <file path=word/document.xml><?xml version="1.0" encoding="utf-8"?>
-<w:document xmlns:wpc="http://schemas.microsoft.com/office/word/2010/wordprocessingCanvas" xmlns:cx="http://schemas.microsoft.com/office/drawing/2014/chartex" xmlns:cx1="http://schemas.microsoft.com/office/drawing/2015/9/8/chartex" xmlns:cx2="http://schemas.microsoft.com/office/drawing/2015/10/21/chartex" xmlns:cx3="http://schemas.microsoft.com/office/drawing/2016/5/9/chartex" xmlns:cx4="http://schemas.microsoft.com/office/drawing/2016/5/10/chartex" xmlns:cx5="http://schemas.microsoft.com/office/drawing/2016/5/11/chartex" xmlns:cx6="http://schemas.microsoft.com/office/drawing/2016/5/12/chartex" xmlns:cx7="http://schemas.microsoft.com/office/drawing/2016/5/13/chartex" xmlns:cx8="http://schemas.microsoft.com/office/drawing/2016/5/14/chartex" xmlns:mc="http://schemas.openxmlformats.org/markup-compatibility/2006" xmlns:aink="http://schemas.microsoft.com/office/drawing/2016/ink" xmlns:am3d="http://schemas.microsoft.com/office/drawing/2017/model3d" xmlns:o="urn:schemas-microsoft-com:office:office" xmlns:oel="http://schemas.microsoft.com/office/2019/extlst" xmlns:r="http://schemas.openxmlformats.org/officeDocument/2006/relationships" xmlns:m="http://schemas.openxmlformats.org/officeDocument/2006/math" xmlns:v="urn:schemas-microsoft-com:vml" xmlns:wp14="http://schemas.microsoft.com/office/word/2010/wordprocessingDrawing" xmlns:wp="http://schemas.openxmlformats.org/drawingml/2006/wordprocessingDrawing" xmlns:w10="urn:schemas-microsoft-com:office:word" xmlns:w="http://schemas.openxmlformats.org/wordprocessingml/2006/main" xmlns:w14="http://schemas.microsoft.com/office/word/2010/wordml" xmlns:w15="http://schemas.microsoft.com/office/word/2012/wordml" xmlns:w16cex="http://schemas.microsoft.com/office/word/2018/wordml/cex" xmlns:w16cid="http://schemas.microsoft.com/office/word/2016/wordml/cid" xmlns:w16="http://schemas.microsoft.com/office/word/2018/wordml" xmlns:w16du="http://schemas.microsoft.com/office/word/2023/wordml/word16du" xmlns:w16sdtdh="http://schemas.microsoft.com/office/word/2020/wordml/sdtdatahash" xmlns:w16sdtfl="http://schemas.microsoft.com/office/word/2024/wordml/sdtformatlock" xmlns:w16se="http://schemas.microsoft.com/office/word/2015/wordml/symex" xmlns:wpg="http://schemas.microsoft.com/office/word/2010/wordprocessingGroup" xmlns:wpi="http://schemas.microsoft.com/office/word/2010/wordprocessingInk" xmlns:wne="http://schemas.microsoft.com/office/word/2006/wordml" xmlns:wps="http://schemas.microsoft.com/office/word/2010/wordprocessingShape" xmlns:a="http://schemas.openxmlformats.org/drawingml/2006/main" xmlns:a16="http://schemas.microsoft.com/office/drawing/2014/main" xmlns:pic="http://schemas.openxmlformats.org/drawingml/2006/picture" xmlns:a14="http://schemas.microsoft.com/office/drawing/2010/main" mc:Ignorable="w14 w15 w16se w16cid w16 w16cex w16sdtdh w16sdtfl w16du wp14">
+<w:document xmlns:wpc="http://schemas.microsoft.com/office/word/2010/wordprocessingCanvas" xmlns:cx="http://schemas.microsoft.com/office/drawing/2014/chartex" xmlns:cx1="http://schemas.microsoft.com/office/drawing/2015/9/8/chartex" xmlns:cx2="http://schemas.microsoft.com/office/drawing/2015/10/21/chartex" xmlns:cx3="http://schemas.microsoft.com/office/drawing/2016/5/9/chartex" xmlns:cx4="http://schemas.microsoft.com/office/drawing/2016/5/10/chartex" xmlns:cx5="http://schemas.microsoft.com/office/drawing/2016/5/11/chartex" xmlns:cx6="http://schemas.microsoft.com/office/drawing/2016/5/12/chartex" xmlns:cx7="http://schemas.microsoft.com/office/drawing/2016/5/13/chartex" xmlns:cx8="http://schemas.microsoft.com/office/drawing/2016/5/14/chartex" xmlns:mc="http://schemas.openxmlformats.org/markup-compatibility/2006" xmlns:aink="http://schemas.microsoft.com/office/drawing/2016/ink" xmlns:am3d="http://schemas.microsoft.com/office/drawing/2017/model3d" xmlns:o="urn:schemas-microsoft-com:office:office" xmlns:oel="http://schemas.microsoft.com/office/2019/extlst" xmlns:r="http://schemas.openxmlformats.org/officeDocument/2006/relationships" xmlns:m="http://schemas.openxmlformats.org/officeDocument/2006/math" xmlns:v="urn:schemas-microsoft-com:vml" xmlns:wp14="http://schemas.microsoft.com/office/word/2010/wordprocessingDrawing" xmlns:wp="http://schemas.openxmlformats.org/drawingml/2006/wordprocessingDrawing" xmlns:w10="urn:schemas-microsoft-com:office:word" xmlns:w="http://schemas.openxmlformats.org/wordprocessingml/2006/main" xmlns:w14="http://schemas.microsoft.com/office/word/2010/wordml" xmlns:w15="http://schemas.microsoft.com/office/word/2012/wordml" xmlns:w16cei="http://schemas.microsoft.com/office/word/2026/wordml/cei" xmlns:w16cex="http://schemas.microsoft.com/office/word/2018/wordml/cex" xmlns:w16cid="http://schemas.microsoft.com/office/word/2016/wordml/cid" xmlns:w16="http://schemas.microsoft.com/office/word/2018/wordml" xmlns:w16du="http://schemas.microsoft.com/office/word/2023/wordml/word16du" xmlns:w16sdtdh="http://schemas.microsoft.com/office/word/2020/wordml/sdtdatahash" xmlns:w16sdtfl="http://schemas.microsoft.com/office/word/2024/wordml/sdtformatlock" xmlns:w16se="http://schemas.microsoft.com/office/word/2015/wordml/symex" xmlns:wpg="http://schemas.microsoft.com/office/word/2010/wordprocessingGroup" xmlns:wpi="http://schemas.microsoft.com/office/word/2010/wordprocessingInk" xmlns:wne="http://schemas.microsoft.com/office/word/2006/wordml" xmlns:wps="http://schemas.microsoft.com/office/word/2010/wordprocessingShape" mc:Ignorable="w14 w15 w16se w16cid w16 w16cex w16sdtdh w16sdtfl w16du wp14">
   <w:body>
     <w:p>
       <w:pPr>
-        <w:pStyle w:val="ListParagraph"/>
+        <w:pStyle w:val="Lijstalinea"/>
         <w:spacing w:line="240" w:lineRule="auto"/>
         <w:ind w:left="1080"/>
         <w:jc w:val="center"/>
         <w:rPr>
           <w:rFonts w:ascii="Calibri" w:hAnsi="Calibri" w:cs="Calibri"/>
-          <w:b w:val="1"/>
-          <w:bCs w:val="1"/>
+          <w:b/>
+          <w:bCs/>
           <w:color w:val="000000" w:themeColor="text1"/>
           <w:sz w:val="28"/>
           <w:szCs w:val="28"/>
@@ -19,7 +19,6 @@
       </w:pPr>
       <w:r>
         <w:rPr>
-          <w:rFonts w:ascii="Arial" w:hAnsi="Arial" w:cs="Arial" w:eastAsia="Arial"/>
           <w:b/>
           <w:bCs/>
           <w:noProof/>
@@ -29,123 +28,316 @@
         </w:rPr>
         <w:t>Appendix 9 - Baseline plantar pressure measurements</w:t>
       </w:r>
+    </w:p>
+    <w:p>
+      <w:pPr>
+        <w:rPr>
+          <w:rFonts w:ascii="Calibri" w:hAnsi="Calibri" w:cs="Calibri"/>
+        </w:rPr>
+      </w:pPr>
       <w:r>
         <w:rPr>
-          <w:rFonts w:ascii="Calibri" w:hAnsi="Calibri" w:cs="Calibri"/>
-          <w:b w:val="1"/>
-          <w:bCs w:val="1"/>
-          <w:color w:val="000000" w:themeColor="text1" w:themeTint="FF" w:themeShade="FF"/>
-          <w:sz w:val="28"/>
-          <w:szCs w:val="28"/>
-        </w:rPr>
-        <w:t>9</w:t>
+          <w:color w:val="24303B"/>
+        </w:rPr>
+        <w:t xml:space="preserve">Deze basismeting wordt uitgevoerd om </w:t>
+      </w:r>
+      <w:r>
+        <w:rPr>
+          <w:color w:val="24303B"/>
+        </w:rPr>
+        <w:t>extra</w:t>
+      </w:r>
+      <w:r>
+        <w:rPr>
+          <w:color w:val="24303B"/>
+        </w:rPr>
+        <w:t xml:space="preserve"> informatie te verschaffen aan de </w:t>
+      </w:r>
+      <w:proofErr w:type="spellStart"/>
+      <w:r>
+        <w:rPr>
+          <w:color w:val="24303B"/>
+        </w:rPr>
+        <w:t>podo-orthesist</w:t>
+      </w:r>
+      <w:proofErr w:type="spellEnd"/>
+      <w:r>
+        <w:rPr>
+          <w:color w:val="24303B"/>
+        </w:rPr>
+        <w:t xml:space="preserve"> voor de </w:t>
+      </w:r>
+      <w:r>
+        <w:rPr>
+          <w:color w:val="24303B"/>
+        </w:rPr>
+        <w:t>aanmaak</w:t>
+      </w:r>
+      <w:r>
+        <w:rPr>
+          <w:color w:val="24303B"/>
+        </w:rPr>
+        <w:t xml:space="preserve"> van de diabetische CMFO. Metingen worden uitgevoerd op blote voeten, waarbij sensoren rechtstreeks op de voet worden bevestigd met dubbelzijdige tape. </w:t>
+      </w:r>
+      <w:r>
+        <w:rPr>
+          <w:color w:val="24303B"/>
+        </w:rPr>
+        <w:t>Nadien</w:t>
+      </w:r>
+      <w:r>
+        <w:rPr>
+          <w:color w:val="24303B"/>
+        </w:rPr>
+        <w:t xml:space="preserve"> worden standaardkousen over de sensoren gedragen. Voor elke voet worden drie drukmetingen uitgevoerd (links en rechts afzonderlijk), waarna een gemiddelde piekdrukafbeelding wordt berekend.</w:t>
+      </w:r>
+      <w:r>
+        <w:rPr>
+          <w:color w:val="24303B"/>
+        </w:rPr>
+        <w:t xml:space="preserve"> </w:t>
+      </w:r>
+      <w:proofErr w:type="spellStart"/>
+      <w:r>
+        <w:rPr>
+          <w:color w:val="24303B"/>
+        </w:rPr>
+        <w:t>Subsampling</w:t>
+      </w:r>
+      <w:proofErr w:type="spellEnd"/>
+      <w:r>
+        <w:rPr>
+          <w:color w:val="24303B"/>
+        </w:rPr>
+        <w:t xml:space="preserve"> van het </w:t>
+      </w:r>
+      <w:proofErr w:type="spellStart"/>
+      <w:r>
+        <w:rPr>
+          <w:color w:val="24303B"/>
+        </w:rPr>
+        <w:t>pedobarografisch</w:t>
+      </w:r>
+      <w:proofErr w:type="spellEnd"/>
+      <w:r>
+        <w:rPr>
+          <w:color w:val="24303B"/>
+        </w:rPr>
+        <w:t xml:space="preserve"> veld dient te gebeuren </w:t>
+      </w:r>
+      <w:r>
+        <w:rPr>
+          <w:color w:val="24303B"/>
+        </w:rPr>
+        <w:t>via de</w:t>
+      </w:r>
+      <w:r>
+        <w:rPr>
+          <w:color w:val="24303B"/>
+        </w:rPr>
+        <w:t xml:space="preserve"> </w:t>
+      </w:r>
+      <w:proofErr w:type="spellStart"/>
+      <w:r>
+        <w:rPr>
+          <w:color w:val="24303B"/>
+        </w:rPr>
+        <w:t>multi-masktool</w:t>
+      </w:r>
+      <w:proofErr w:type="spellEnd"/>
+      <w:r>
+        <w:rPr>
+          <w:color w:val="24303B"/>
+        </w:rPr>
+        <w:t xml:space="preserve"> en moet de voet onderverdelen in </w:t>
+      </w:r>
+      <w:r>
+        <w:rPr>
+          <w:color w:val="24303B"/>
+        </w:rPr>
+        <w:t>8</w:t>
+      </w:r>
+      <w:r>
+        <w:rPr>
+          <w:color w:val="24303B"/>
+        </w:rPr>
+        <w:t xml:space="preserve"> interessegebieden (cf. figuur).</w:t>
       </w:r>
     </w:p>
     <w:p>
       <w:pPr>
+        <w:tabs>
+          <w:tab w:val="left" w:leader="underscore" w:pos="8505"/>
+        </w:tabs>
+        <w:spacing w:line="360" w:lineRule="auto"/>
         <w:rPr>
           <w:rFonts w:ascii="Calibri" w:hAnsi="Calibri" w:cs="Calibri"/>
+          <w:b/>
+          <w:bCs/>
+          <w:sz w:val="24"/>
+          <w:szCs w:val="24"/>
         </w:rPr>
       </w:pPr>
       <w:r>
         <w:rPr>
-          <w:rFonts w:ascii="Arial" w:hAnsi="Arial" w:cs="Arial" w:eastAsia="Arial"/>
-          <w:color w:val="24303B"/>
-        </w:rPr>
-        <w:t xml:space="preserve">Deze basismeting wordt uitgevoerd om </w:t>
-      </w:r>
-      <w:r>
-        <w:rPr>
-          <w:rFonts w:ascii="Arial" w:hAnsi="Arial" w:cs="Arial" w:eastAsia="Arial"/>
-          <w:color w:val="24303B"/>
-        </w:rPr>
-        <w:t>extra</w:t>
-      </w:r>
-      <w:r>
-        <w:rPr>
-          <w:rFonts w:ascii="Arial" w:hAnsi="Arial" w:cs="Arial" w:eastAsia="Arial"/>
-          <w:color w:val="24303B"/>
-        </w:rPr>
-        <w:t xml:space="preserve"> informatie te verschaffen aan de podo-orthesist voor de </w:t>
-      </w:r>
-      <w:r>
-        <w:rPr>
-          <w:rFonts w:ascii="Arial" w:hAnsi="Arial" w:cs="Arial" w:eastAsia="Arial"/>
-          <w:color w:val="24303B"/>
-        </w:rPr>
-        <w:t>aanmaak</w:t>
-      </w:r>
-      <w:r>
-        <w:rPr>
-          <w:rFonts w:ascii="Arial" w:hAnsi="Arial" w:cs="Arial" w:eastAsia="Arial"/>
-          <w:color w:val="24303B"/>
-        </w:rPr>
-        <w:t xml:space="preserve"> van de diabetische CMFO. Metingen worden uitgevoerd op blote voeten, waarbij sensoren rechtstreeks op de voet worden bevestigd met dubbelzijdige tape. </w:t>
-      </w:r>
-      <w:r>
-        <w:rPr>
-          <w:rFonts w:ascii="Arial" w:hAnsi="Arial" w:cs="Arial" w:eastAsia="Arial"/>
-          <w:color w:val="24303B"/>
-        </w:rPr>
-        <w:t>Nadien</w:t>
-      </w:r>
-      <w:r>
-        <w:rPr>
-          <w:rFonts w:ascii="Arial" w:hAnsi="Arial" w:cs="Arial" w:eastAsia="Arial"/>
-          <w:color w:val="24303B"/>
-        </w:rPr>
-        <w:t xml:space="preserve"> worden standaardkousen over de sensoren gedragen. Voor elke voet worden drie drukmetingen uitgevoerd (links en rechts afzonderlijk), waarna een gemiddelde piekdrukafbeelding wordt berekend.</w:t>
-      </w:r>
-      <w:r>
-        <w:rPr>
-          <w:rFonts w:ascii="Arial" w:hAnsi="Arial" w:cs="Arial" w:eastAsia="Arial"/>
-          <w:color w:val="24303B"/>
-        </w:rPr>
-        <w:t xml:space="preserve"> </w:t>
-      </w:r>
-      <w:r>
-        <w:rPr>
-          <w:rFonts w:ascii="Arial" w:hAnsi="Arial" w:cs="Arial" w:eastAsia="Arial"/>
-          <w:color w:val="24303B"/>
-        </w:rPr>
-        <w:t xml:space="preserve">Subsampling van het pedobarografisch veld dient te gebeuren </w:t>
-      </w:r>
-      <w:r>
-        <w:rPr>
-          <w:rFonts w:ascii="Arial" w:hAnsi="Arial" w:cs="Arial" w:eastAsia="Arial"/>
-          <w:color w:val="24303B"/>
-        </w:rPr>
-        <w:t>via de</w:t>
-      </w:r>
-      <w:r>
-        <w:rPr>
-          <w:rFonts w:ascii="Arial" w:hAnsi="Arial" w:cs="Arial" w:eastAsia="Arial"/>
-          <w:color w:val="24303B"/>
-        </w:rPr>
-        <w:t xml:space="preserve"> multi-masktool en moet de voet onderverdelen in 8 interessegebieden (cf. figuur).</w:t>
+          <w:b/>
+          <w:bCs/>
+          <w:color w:val="123A5F"/>
+          <w:sz w:val="24"/>
+          <w:szCs w:val="24"/>
+        </w:rPr>
+        <w:t>Studie-informatie</w:t>
       </w:r>
     </w:p>
     <w:p>
       <w:pPr>
+        <w:numPr>
+          <w:ilvl w:val="0"/>
+          <w:numId w:val="2"/>
+        </w:numPr>
+        <w:tabs>
+          <w:tab w:val="left" w:leader="underscore" w:pos="8505"/>
+        </w:tabs>
+        <w:spacing w:line="360" w:lineRule="auto"/>
         <w:rPr>
           <w:rFonts w:ascii="Calibri" w:hAnsi="Calibri" w:cs="Calibri"/>
-          <w:b/>
-          <w:bCs/>
-          <w:color w:val="EE0000"/>
-          <w:sz w:val="28"/>
-          <w:szCs w:val="28"/>
-        </w:rPr>
-      </w:pPr>
+          <w:lang w:val="en-GB"/>
+        </w:rPr>
+      </w:pPr>
+      <w:r>
+        <w:rPr>
+          <w:color w:val="24303B"/>
+          <w:lang w:val="en-GB"/>
+        </w:rPr>
+        <w:t xml:space="preserve">Studie </w:t>
+      </w:r>
+      <w:proofErr w:type="spellStart"/>
+      <w:r>
+        <w:rPr>
+          <w:color w:val="24303B"/>
+          <w:lang w:val="en-GB"/>
+        </w:rPr>
+        <w:t>titel</w:t>
+      </w:r>
+      <w:proofErr w:type="spellEnd"/>
+      <w:r>
+        <w:rPr>
+          <w:color w:val="24303B"/>
+          <w:lang w:val="en-GB"/>
+        </w:rPr>
+        <w:t>: Towards Pressure-Adherence &amp; Education Driven Service in Diabetic Foot Disease (PARADISE trial)</w:t>
+      </w:r>
     </w:p>
     <w:p>
       <w:pPr>
+        <w:numPr>
+          <w:ilvl w:val="0"/>
+          <w:numId w:val="2"/>
+        </w:numPr>
+        <w:tabs>
+          <w:tab w:val="left" w:leader="underscore" w:pos="8505"/>
+        </w:tabs>
+        <w:spacing w:line="360" w:lineRule="auto"/>
         <w:rPr>
           <w:rFonts w:ascii="Calibri" w:hAnsi="Calibri" w:cs="Calibri"/>
         </w:rPr>
       </w:pPr>
       <w:r>
         <w:rPr>
-          <w:rFonts w:ascii="Arial" w:hAnsi="Arial" w:cs="Arial" w:eastAsia="Arial"/>
+          <w:color w:val="24303B"/>
+        </w:rPr>
+        <w:t>Protocolnummer: S71769</w:t>
+      </w:r>
+    </w:p>
+    <w:p>
+      <w:pPr>
+        <w:numPr>
+          <w:ilvl w:val="0"/>
+          <w:numId w:val="2"/>
+        </w:numPr>
+        <w:tabs>
+          <w:tab w:val="left" w:leader="underscore" w:pos="8505"/>
+        </w:tabs>
+        <w:spacing w:line="360" w:lineRule="auto"/>
+        <w:rPr>
+          <w:rFonts w:ascii="Calibri" w:hAnsi="Calibri" w:cs="Calibri"/>
+        </w:rPr>
+      </w:pPr>
+      <w:r>
+        <w:rPr>
+          <w:color w:val="24303B"/>
+        </w:rPr>
+        <w:t xml:space="preserve">Studielocatie: </w:t>
+      </w:r>
+      <w:r>
+        <w:rPr>
+          <w:color w:val="24303B"/>
+        </w:rPr>
+        <w:tab/>
+      </w:r>
+    </w:p>
+    <w:p>
+      <w:pPr>
+        <w:numPr>
+          <w:ilvl w:val="0"/>
+          <w:numId w:val="2"/>
+        </w:numPr>
+        <w:tabs>
+          <w:tab w:val="left" w:leader="underscore" w:pos="8505"/>
+        </w:tabs>
+        <w:spacing w:line="360" w:lineRule="auto"/>
+        <w:rPr>
+          <w:rFonts w:ascii="Calibri" w:hAnsi="Calibri" w:cs="Calibri"/>
+        </w:rPr>
+      </w:pPr>
+      <w:r>
+        <w:rPr>
+          <w:color w:val="24303B"/>
+        </w:rPr>
+        <w:t xml:space="preserve">Hoofdonderzoeker (PI): </w:t>
+      </w:r>
+      <w:r>
+        <w:rPr>
+          <w:color w:val="24303B"/>
+        </w:rPr>
+        <w:tab/>
+      </w:r>
+    </w:p>
+    <w:p>
+      <w:pPr>
+        <w:numPr>
+          <w:ilvl w:val="0"/>
+          <w:numId w:val="2"/>
+        </w:numPr>
+        <w:tabs>
+          <w:tab w:val="left" w:leader="underscore" w:pos="8505"/>
+        </w:tabs>
+        <w:spacing w:line="360" w:lineRule="auto"/>
+        <w:rPr>
+          <w:rFonts w:ascii="Calibri" w:hAnsi="Calibri" w:cs="Calibri"/>
+        </w:rPr>
+      </w:pPr>
+      <w:r>
+        <w:rPr>
+          <w:color w:val="24303B"/>
+        </w:rPr>
+        <w:t xml:space="preserve">Deelnemerscode: </w:t>
+      </w:r>
+      <w:r>
+        <w:rPr>
+          <w:color w:val="24303B"/>
+        </w:rPr>
+        <w:tab/>
+      </w:r>
+    </w:p>
+    <w:p>
+      <w:pPr>
+        <w:rPr>
+          <w:rFonts w:ascii="Calibri" w:hAnsi="Calibri" w:cs="Calibri"/>
+        </w:rPr>
+      </w:pPr>
+      <w:r>
+        <w:rPr>
           <w:b/>
           <w:bCs/>
           <w:color w:val="24303B"/>
@@ -154,7 +346,6 @@
       </w:r>
       <w:r>
         <w:rPr>
-          <w:rFonts w:ascii="Arial" w:hAnsi="Arial" w:cs="Arial" w:eastAsia="Arial"/>
           <w:b/>
           <w:bCs/>
           <w:color w:val="24303B"/>
@@ -163,7 +354,6 @@
       </w:r>
       <w:r>
         <w:rPr>
-          <w:rFonts w:ascii="Arial" w:hAnsi="Arial" w:cs="Arial" w:eastAsia="Arial"/>
           <w:b/>
           <w:bCs/>
           <w:color w:val="24303B"/>
@@ -172,7 +362,6 @@
       </w:r>
       <w:r>
         <w:rPr>
-          <w:rFonts w:ascii="Arial" w:hAnsi="Arial" w:cs="Arial" w:eastAsia="Arial"/>
           <w:color w:val="24303B"/>
         </w:rPr>
         <w:t xml:space="preserve"> Baseline gemiddelde piekdruk op blote voeten</w:t>
@@ -180,7 +369,7 @@
     </w:p>
     <w:tbl>
       <w:tblPr>
-        <w:tblStyle w:val="TableGrid"/>
+        <w:tblStyle w:val="Tabelraster"/>
         <w:tblW w:w="0" w:type="auto"/>
         <w:tblLook w:val="04A0" w:firstRow="1" w:lastRow="0" w:firstColumn="1" w:lastColumn="0" w:noHBand="0" w:noVBand="1"/>
       </w:tblPr>
@@ -224,7 +413,6 @@
             </w:pPr>
             <w:r>
               <w:rPr>
-                <w:rFonts w:ascii="Arial" w:hAnsi="Arial" w:cs="Arial" w:eastAsia="Arial"/>
                 <w:b/>
                 <w:bCs/>
                 <w:color w:val="123A5F"/>
@@ -252,7 +440,6 @@
             </w:pPr>
             <w:r>
               <w:rPr>
-                <w:rFonts w:ascii="Arial" w:hAnsi="Arial" w:cs="Arial" w:eastAsia="Arial"/>
                 <w:b/>
                 <w:bCs/>
                 <w:color w:val="123A5F"/>
@@ -282,7 +469,6 @@
             </w:pPr>
             <w:r>
               <w:rPr>
-                <w:rFonts w:ascii="Arial" w:hAnsi="Arial" w:cs="Arial" w:eastAsia="Arial"/>
                 <w:b/>
                 <w:bCs/>
                 <w:color w:val="123A5F"/>
@@ -310,7 +496,6 @@
             </w:pPr>
             <w:r>
               <w:rPr>
-                <w:rFonts w:ascii="Arial" w:hAnsi="Arial" w:cs="Arial" w:eastAsia="Arial"/>
                 <w:b/>
                 <w:bCs/>
                 <w:color w:val="123A5F"/>
@@ -338,7 +523,6 @@
             </w:pPr>
             <w:r>
               <w:rPr>
-                <w:rFonts w:ascii="Arial" w:hAnsi="Arial" w:cs="Arial" w:eastAsia="Arial"/>
                 <w:b/>
                 <w:bCs/>
                 <w:color w:val="123A5F"/>
@@ -362,17 +546,8 @@
                 <w:rFonts w:ascii="Calibri" w:hAnsi="Calibri" w:cs="Calibri"/>
               </w:rPr>
             </w:pPr>
-          </w:p>
-          <w:p>
-            <w:pPr>
-              <w:jc w:val="center"/>
-              <w:rPr>
-                <w:rFonts w:ascii="Calibri" w:hAnsi="Calibri" w:cs="Calibri"/>
-              </w:rPr>
-            </w:pPr>
             <w:r>
               <w:rPr>
-                <w:rFonts w:ascii="Arial" w:hAnsi="Arial" w:cs="Arial" w:eastAsia="Arial"/>
                 <w:color w:val="24303B"/>
               </w:rPr>
               <w:t>Hiel</w:t>
@@ -426,17 +601,8 @@
                 <w:rFonts w:ascii="Calibri" w:hAnsi="Calibri" w:cs="Calibri"/>
               </w:rPr>
             </w:pPr>
-          </w:p>
-          <w:p>
-            <w:pPr>
-              <w:jc w:val="center"/>
-              <w:rPr>
-                <w:rFonts w:ascii="Calibri" w:hAnsi="Calibri" w:cs="Calibri"/>
-              </w:rPr>
-            </w:pPr>
             <w:r>
               <w:rPr>
-                <w:rFonts w:ascii="Arial" w:hAnsi="Arial" w:cs="Arial" w:eastAsia="Arial"/>
                 <w:color w:val="24303B"/>
               </w:rPr>
               <w:t>Mediale middenvoet</w:t>
@@ -490,17 +656,8 @@
                 <w:rFonts w:ascii="Calibri" w:hAnsi="Calibri" w:cs="Calibri"/>
               </w:rPr>
             </w:pPr>
-          </w:p>
-          <w:p>
-            <w:pPr>
-              <w:jc w:val="center"/>
-              <w:rPr>
-                <w:rFonts w:ascii="Calibri" w:hAnsi="Calibri" w:cs="Calibri"/>
-              </w:rPr>
-            </w:pPr>
             <w:r>
               <w:rPr>
-                <w:rFonts w:ascii="Arial" w:hAnsi="Arial" w:cs="Arial" w:eastAsia="Arial"/>
                 <w:color w:val="24303B"/>
               </w:rPr>
               <w:t>Laterale middenvoet</w:t>
@@ -554,20 +711,19 @@
                 <w:rFonts w:ascii="Calibri" w:hAnsi="Calibri" w:cs="Calibri"/>
               </w:rPr>
             </w:pPr>
-          </w:p>
-          <w:p>
-            <w:pPr>
-              <w:jc w:val="center"/>
-              <w:rPr>
-                <w:rFonts w:ascii="Calibri" w:hAnsi="Calibri" w:cs="Calibri"/>
-              </w:rPr>
-            </w:pPr>
+            <w:proofErr w:type="spellStart"/>
             <w:r>
               <w:rPr>
-                <w:rFonts w:ascii="Arial" w:hAnsi="Arial" w:cs="Arial" w:eastAsia="Arial"/>
                 <w:color w:val="24303B"/>
               </w:rPr>
-              <w:t>Metatarsaal 1</w:t>
+              <w:t>Metatarsaal</w:t>
+            </w:r>
+            <w:proofErr w:type="spellEnd"/>
+            <w:r>
+              <w:rPr>
+                <w:color w:val="24303B"/>
+              </w:rPr>
+              <w:t xml:space="preserve"> 1</w:t>
             </w:r>
           </w:p>
         </w:tc>
@@ -618,20 +774,19 @@
                 <w:rFonts w:ascii="Calibri" w:hAnsi="Calibri" w:cs="Calibri"/>
               </w:rPr>
             </w:pPr>
-          </w:p>
-          <w:p>
-            <w:pPr>
-              <w:jc w:val="center"/>
-              <w:rPr>
-                <w:rFonts w:ascii="Calibri" w:hAnsi="Calibri" w:cs="Calibri"/>
-              </w:rPr>
-            </w:pPr>
+            <w:proofErr w:type="spellStart"/>
             <w:r>
               <w:rPr>
-                <w:rFonts w:ascii="Arial" w:hAnsi="Arial" w:cs="Arial" w:eastAsia="Arial"/>
                 <w:color w:val="24303B"/>
               </w:rPr>
-              <w:t>Metatarsaal 2-3</w:t>
+              <w:t>Metatarsaal</w:t>
+            </w:r>
+            <w:proofErr w:type="spellEnd"/>
+            <w:r>
+              <w:rPr>
+                <w:color w:val="24303B"/>
+              </w:rPr>
+              <w:t xml:space="preserve"> 2-3</w:t>
             </w:r>
           </w:p>
         </w:tc>
@@ -682,20 +837,19 @@
                 <w:rFonts w:ascii="Calibri" w:hAnsi="Calibri" w:cs="Calibri"/>
               </w:rPr>
             </w:pPr>
-          </w:p>
-          <w:p>
-            <w:pPr>
-              <w:jc w:val="center"/>
-              <w:rPr>
-                <w:rFonts w:ascii="Calibri" w:hAnsi="Calibri" w:cs="Calibri"/>
-              </w:rPr>
-            </w:pPr>
+            <w:proofErr w:type="spellStart"/>
             <w:r>
               <w:rPr>
-                <w:rFonts w:ascii="Arial" w:hAnsi="Arial" w:cs="Arial" w:eastAsia="Arial"/>
                 <w:color w:val="24303B"/>
               </w:rPr>
-              <w:t>Metatarsaal 4-5</w:t>
+              <w:t>Metatarsaal</w:t>
+            </w:r>
+            <w:proofErr w:type="spellEnd"/>
+            <w:r>
+              <w:rPr>
+                <w:color w:val="24303B"/>
+              </w:rPr>
+              <w:t xml:space="preserve"> 4-5</w:t>
             </w:r>
           </w:p>
         </w:tc>
@@ -743,24 +897,17 @@
             <w:pPr>
               <w:jc w:val="center"/>
               <w:rPr>
-                <w:rFonts w:ascii="Calibri" w:hAnsi="Calibri" w:cs="Calibri"/>
-              </w:rPr>
-            </w:pPr>
-          </w:p>
-          <w:p>
-            <w:pPr>
-              <w:jc w:val="center"/>
-              <w:rPr>
-                <w:rFonts w:ascii="Calibri" w:hAnsi="Calibri" w:cs="Calibri"/>
-              </w:rPr>
-            </w:pPr>
+                <w:color w:val="24303B"/>
+              </w:rPr>
+            </w:pPr>
+            <w:proofErr w:type="spellStart"/>
             <w:r>
               <w:rPr>
-                <w:rFonts w:ascii="Arial" w:hAnsi="Arial" w:cs="Arial" w:eastAsia="Arial"/>
                 <w:color w:val="24303B"/>
               </w:rPr>
               <w:t>Hallux</w:t>
             </w:r>
+            <w:proofErr w:type="spellEnd"/>
           </w:p>
         </w:tc>
         <w:tc>
@@ -807,23 +954,14 @@
             <w:pPr>
               <w:jc w:val="center"/>
               <w:rPr>
-                <w:rFonts w:ascii="Calibri" w:hAnsi="Calibri" w:cs="Calibri"/>
-              </w:rPr>
-            </w:pPr>
-          </w:p>
-          <w:p>
-            <w:pPr>
-              <w:jc w:val="center"/>
-              <w:rPr>
-                <w:rFonts w:ascii="Calibri" w:hAnsi="Calibri" w:cs="Calibri"/>
+                <w:color w:val="24303B"/>
               </w:rPr>
             </w:pPr>
             <w:r>
               <w:rPr>
-                <w:rFonts w:ascii="Arial" w:hAnsi="Arial" w:cs="Arial" w:eastAsia="Arial"/>
                 <w:color w:val="24303B"/>
               </w:rPr>
-              <w:t>Tenen 2-3</w:t>
+              <w:t>Tenen 2-5</w:t>
             </w:r>
           </w:p>
         </w:tc>
@@ -866,31 +1004,62 @@
     <w:p>
       <w:pPr>
         <w:rPr>
-          <w:rFonts w:ascii="Calibri" w:hAnsi="Calibri" w:cs="Calibri"/>
           <w:color w:val="000000" w:themeColor="text1"/>
-          <w:sz w:val="24"/>
-          <w:szCs w:val="24"/>
         </w:rPr>
       </w:pPr>
     </w:p>
     <w:p>
       <w:pPr>
         <w:rPr>
-          <w:rFonts w:ascii="Calibri" w:hAnsi="Calibri" w:cs="Calibri"/>
           <w:color w:val="000000" w:themeColor="text1"/>
         </w:rPr>
       </w:pPr>
+    </w:p>
+    <w:p>
+      <w:pPr>
+        <w:rPr>
+          <w:color w:val="000000" w:themeColor="text1"/>
+        </w:rPr>
+      </w:pPr>
+    </w:p>
+    <w:p>
+      <w:pPr>
+        <w:rPr>
+          <w:color w:val="000000" w:themeColor="text1"/>
+        </w:rPr>
+      </w:pPr>
+    </w:p>
+    <w:p>
+      <w:pPr>
+        <w:rPr>
+          <w:color w:val="000000" w:themeColor="text1"/>
+        </w:rPr>
+      </w:pPr>
+    </w:p>
+    <w:p>
+      <w:pPr>
+        <w:rPr>
+          <w:color w:val="000000" w:themeColor="text1"/>
+        </w:rPr>
+      </w:pPr>
+    </w:p>
+    <w:p>
+      <w:pPr>
+        <w:rPr>
+          <w:color w:val="000000" w:themeColor="text1"/>
+        </w:rPr>
+      </w:pPr>
       <w:r>
         <w:rPr>
-          <w:rFonts w:ascii="Arial" w:hAnsi="Arial" w:cs="Arial" w:eastAsia="Arial"/>
           <w:color w:val="000000" w:themeColor="text1"/>
         </w:rPr>
+        <w:lastRenderedPageBreak/>
         <w:t>Definieer de drie doelregio’s die ontlast moeten worden (op basis van voorgeschiedenis van voetzweer en één of twee andere regio’s met de hoogste piekdruk)</w:t>
       </w:r>
     </w:p>
     <w:tbl>
       <w:tblPr>
-        <w:tblStyle w:val="TableGrid"/>
+        <w:tblStyle w:val="Tabelraster"/>
         <w:tblW w:w="0" w:type="auto"/>
         <w:tblLook w:val="04A0" w:firstRow="1" w:lastRow="0" w:firstColumn="1" w:lastColumn="0" w:noHBand="0" w:noVBand="1"/>
       </w:tblPr>
@@ -918,7 +1087,6 @@
             </w:pPr>
             <w:r>
               <w:rPr>
-                <w:rFonts w:ascii="Arial" w:hAnsi="Arial" w:cs="Arial" w:eastAsia="Arial"/>
                 <w:b/>
                 <w:bCs/>
                 <w:color w:val="123A5F"/>
@@ -947,7 +1115,6 @@
             </w:pPr>
             <w:r>
               <w:rPr>
-                <w:rFonts w:ascii="Arial" w:hAnsi="Arial" w:cs="Arial" w:eastAsia="Arial"/>
                 <w:b/>
                 <w:bCs/>
                 <w:color w:val="123A5F"/>
@@ -969,7 +1136,6 @@
             </w:pPr>
             <w:r>
               <w:rPr>
-                <w:rFonts w:ascii="Arial" w:hAnsi="Arial" w:cs="Arial" w:eastAsia="Arial"/>
                 <w:color w:val="000000" w:themeColor="text1"/>
                 <w:sz w:val="24"/>
                 <w:szCs w:val="24"/>
@@ -996,7 +1162,6 @@
             </w:pPr>
             <w:r>
               <w:rPr>
-                <w:rFonts w:ascii="Arial" w:hAnsi="Arial" w:cs="Arial" w:eastAsia="Arial"/>
                 <w:b/>
                 <w:bCs/>
                 <w:color w:val="123A5F"/>
@@ -1018,7 +1183,6 @@
             </w:pPr>
             <w:r>
               <w:rPr>
-                <w:rFonts w:ascii="Arial" w:hAnsi="Arial" w:cs="Arial" w:eastAsia="Arial"/>
                 <w:color w:val="000000" w:themeColor="text1"/>
                 <w:sz w:val="24"/>
                 <w:szCs w:val="24"/>
@@ -1055,7 +1219,6 @@
             </w:pPr>
             <w:r>
               <w:rPr>
-                <w:rFonts w:ascii="Arial" w:hAnsi="Arial" w:cs="Arial" w:eastAsia="Arial"/>
                 <w:color w:val="000000" w:themeColor="text1"/>
                 <w:sz w:val="24"/>
                 <w:szCs w:val="24"/>
@@ -1138,7 +1301,6 @@
             </w:pPr>
             <w:r>
               <w:rPr>
-                <w:rFonts w:ascii="Arial" w:hAnsi="Arial" w:cs="Arial" w:eastAsia="Arial"/>
                 <w:color w:val="000000" w:themeColor="text1"/>
                 <w:sz w:val="24"/>
                 <w:szCs w:val="24"/>
@@ -1209,7 +1371,6 @@
             </w:pPr>
             <w:r>
               <w:rPr>
-                <w:rFonts w:ascii="Arial" w:hAnsi="Arial" w:cs="Arial" w:eastAsia="Arial"/>
                 <w:color w:val="000000" w:themeColor="text1"/>
                 <w:sz w:val="24"/>
                 <w:szCs w:val="24"/>
@@ -1256,84 +1417,6 @@
     </w:tbl>
     <w:p>
       <w:pPr>
-        <w:jc w:val="center"/>
-        <w:rPr>
-          <w:rFonts w:ascii="Calibri" w:hAnsi="Calibri" w:cs="Calibri"/>
-          <w:b/>
-          <w:bCs/>
-          <w:color w:val="EE0000"/>
-          <w:sz w:val="28"/>
-          <w:szCs w:val="28"/>
-          <w:lang w:val="en-US"/>
-        </w:rPr>
-      </w:pPr>
-      <w:r>
-        <w:rPr>
-          <w:rFonts w:ascii="Arial" w:hAnsi="Arial" w:cs="Arial" w:eastAsia="Arial"/>
-          <w:b/>
-          <w:bCs/>
-          <w:color w:val="123A5F"/>
-          <w:sz w:val="28"/>
-          <w:szCs w:val="28"/>
-          <w:lang w:val="en-US"/>
-        </w:rPr>
-        <w:br w:type="page"/>
-      </w:r>
-      <w:r>
-        <w:rPr>
-          <w:rFonts w:ascii="Arial" w:hAnsi="Arial" w:cs="Arial" w:eastAsia="Arial"/>
-          <w:b/>
-          <w:bCs/>
-          <w:color w:val="123A5F"/>
-          <w:sz w:val="28"/>
-          <w:szCs w:val="28"/>
-          <w:lang w:val="en-US"/>
-        </w:rPr>
-        <w:t>Appendix 7 bis: SOP Pressure monitoring in patients with diabetes</w:t>
-      </w:r>
-    </w:p>
-    <w:p>
-      <w:pPr>
-        <w:rPr>
-          <w:rFonts w:ascii="Calibri" w:hAnsi="Calibri" w:cs="Calibri"/>
-          <w:b/>
-          <w:bCs/>
-          <w:color w:val="EE0000"/>
-          <w:lang w:val="en-US"/>
-        </w:rPr>
-      </w:pPr>
-    </w:p>
-    <w:p>
-      <w:pPr>
-        <w:pStyle w:val="ListParagraph"/>
-        <w:numPr>
-          <w:ilvl w:val="0"/>
-          <w:numId w:val="1"/>
-        </w:numPr>
-        <w:rPr>
-          <w:rFonts w:ascii="Calibri" w:hAnsi="Calibri" w:cs="Calibri"/>
-          <w:b/>
-          <w:bCs/>
-          <w:color w:val="EE0000"/>
-        </w:rPr>
-      </w:pPr>
-      <w:r>
-        <w:rPr>
-          <w:rFonts w:ascii="Arial" w:hAnsi="Arial" w:cs="Arial" w:eastAsia="Arial"/>
-          <w:b/>
-          <w:bCs/>
-          <w:color w:val="123A5F"/>
-        </w:rPr>
-        <w:t>Beschrijving SOP</w:t>
-      </w:r>
-    </w:p>
-    <w:p>
-      <w:pPr>
-        <w:pStyle w:val="ListParagraph"/>
-        <w:numPr>
-          <w:ilvl w:val="0"/>
-          <w:numId w:val="1"/>
-        </w:numPr>
         <w:rPr>
           <w:rFonts w:ascii="Calibri" w:hAnsi="Calibri" w:cs="Calibri"/>
           <w:b/>
@@ -1342,51 +1425,11 @@
           <w:lang w:val="nl-NL"/>
         </w:rPr>
       </w:pPr>
-      <w:r>
-        <w:rPr>
-          <w:rFonts w:ascii="Arial" w:hAnsi="Arial" w:cs="Arial" w:eastAsia="Arial"/>
-          <w:b/>
-          <w:bCs/>
-          <w:color w:val="123A5F"/>
-          <w:lang w:val="nl-NL"/>
-        </w:rPr>
-        <w:t xml:space="preserve">Beschrijving dataverwerking (mapping) + gebruik van </w:t>
-      </w:r>
-      <w:r>
-        <w:rPr>
-          <w:rFonts w:ascii="Arial" w:hAnsi="Arial" w:cs="Arial" w:eastAsia="Arial"/>
-          <w:b/>
-          <w:bCs/>
-          <w:color w:val="123A5F"/>
-          <w:highlight w:val="yellow"/>
-          <w:lang w:val="nl-NL"/>
-        </w:rPr>
-        <w:t>Pressure Monitoring Tool (Excel file)</w:t>
-      </w:r>
     </w:p>
-    <w:p>
-      <w:pPr>
-        <w:tabs>
-          <w:tab w:val="left" w:leader="dot" w:pos="8505"/>
-        </w:tabs>
-        <w:spacing w:after="120" w:line="360" w:lineRule="auto"/>
-        <w:jc w:val="center"/>
-        <w:rPr>
-          <w:rFonts w:ascii="Calibri" w:hAnsi="Calibri" w:cs="Calibri"/>
-          <w:b/>
-          <w:bCs/>
-          <w:color w:val="000000" w:themeColor="text1"/>
-          <w:sz w:val="28"/>
-          <w:szCs w:val="28"/>
-          <w:lang w:val="nl-NL"/>
-        </w:rPr>
-      </w:pPr>
-    </w:p>
-    <w:p/>
     <w:sectPr>
-      <w:headerReference w:type="default" r:id="rId8"/>
-      <w:footerReference w:type="default" r:id="rId9"/>
-      <w:pgSz w:w="11906" w:h="16838" w:orient="portrait"/>
+      <w:headerReference w:type="default" r:id="rId10"/>
+      <w:footerReference w:type="default" r:id="rId11"/>
+      <w:pgSz w:w="11906" w:h="16838"/>
       <w:pgMar w:top="1440" w:right="1440" w:bottom="1440" w:left="1440" w:header="708" w:footer="708" w:gutter="0"/>
       <w:cols w:space="708"/>
       <w:docGrid w:linePitch="360"/>
@@ -1396,7 +1439,7 @@
 </file>
 
 <file path=word/endnotes.xml><?xml version="1.0" encoding="utf-8"?>
-<w:endnotes xmlns:wpc="http://schemas.microsoft.com/office/word/2010/wordprocessingCanvas" xmlns:cx="http://schemas.microsoft.com/office/drawing/2014/chartex" xmlns:cx1="http://schemas.microsoft.com/office/drawing/2015/9/8/chartex" xmlns:cx2="http://schemas.microsoft.com/office/drawing/2015/10/21/chartex" xmlns:cx3="http://schemas.microsoft.com/office/drawing/2016/5/9/chartex" xmlns:cx4="http://schemas.microsoft.com/office/drawing/2016/5/10/chartex" xmlns:cx5="http://schemas.microsoft.com/office/drawing/2016/5/11/chartex" xmlns:cx6="http://schemas.microsoft.com/office/drawing/2016/5/12/chartex" xmlns:cx7="http://schemas.microsoft.com/office/drawing/2016/5/13/chartex" xmlns:cx8="http://schemas.microsoft.com/office/drawing/2016/5/14/chartex" xmlns:mc="http://schemas.openxmlformats.org/markup-compatibility/2006" xmlns:aink="http://schemas.microsoft.com/office/drawing/2016/ink" xmlns:am3d="http://schemas.microsoft.com/office/drawing/2017/model3d" xmlns:o="urn:schemas-microsoft-com:office:office" xmlns:oel="http://schemas.microsoft.com/office/2019/extlst" xmlns:r="http://schemas.openxmlformats.org/officeDocument/2006/relationships" xmlns:m="http://schemas.openxmlformats.org/officeDocument/2006/math" xmlns:v="urn:schemas-microsoft-com:vml" xmlns:wp14="http://schemas.microsoft.com/office/word/2010/wordprocessingDrawing" xmlns:wp="http://schemas.openxmlformats.org/drawingml/2006/wordprocessingDrawing" xmlns:w10="urn:schemas-microsoft-com:office:word" xmlns:w="http://schemas.openxmlformats.org/wordprocessingml/2006/main" xmlns:w14="http://schemas.microsoft.com/office/word/2010/wordml" xmlns:w15="http://schemas.microsoft.com/office/word/2012/wordml" xmlns:w16cex="http://schemas.microsoft.com/office/word/2018/wordml/cex" xmlns:w16cid="http://schemas.microsoft.com/office/word/2016/wordml/cid" xmlns:w16="http://schemas.microsoft.com/office/word/2018/wordml" xmlns:w16du="http://schemas.microsoft.com/office/word/2023/wordml/word16du" xmlns:w16sdtdh="http://schemas.microsoft.com/office/word/2020/wordml/sdtdatahash" xmlns:w16sdtfl="http://schemas.microsoft.com/office/word/2024/wordml/sdtformatlock" xmlns:w16se="http://schemas.microsoft.com/office/word/2015/wordml/symex" xmlns:wpg="http://schemas.microsoft.com/office/word/2010/wordprocessingGroup" xmlns:wpi="http://schemas.microsoft.com/office/word/2010/wordprocessingInk" xmlns:wne="http://schemas.microsoft.com/office/word/2006/wordml" xmlns:wps="http://schemas.microsoft.com/office/word/2010/wordprocessingShape" mc:Ignorable="w14 w15 w16se w16cid w16 w16cex w16sdtdh w16sdtfl w16du wp14">
+<w:endnotes xmlns:wpc="http://schemas.microsoft.com/office/word/2010/wordprocessingCanvas" xmlns:cx="http://schemas.microsoft.com/office/drawing/2014/chartex" xmlns:cx1="http://schemas.microsoft.com/office/drawing/2015/9/8/chartex" xmlns:cx2="http://schemas.microsoft.com/office/drawing/2015/10/21/chartex" xmlns:cx3="http://schemas.microsoft.com/office/drawing/2016/5/9/chartex" xmlns:cx4="http://schemas.microsoft.com/office/drawing/2016/5/10/chartex" xmlns:cx5="http://schemas.microsoft.com/office/drawing/2016/5/11/chartex" xmlns:cx6="http://schemas.microsoft.com/office/drawing/2016/5/12/chartex" xmlns:cx7="http://schemas.microsoft.com/office/drawing/2016/5/13/chartex" xmlns:cx8="http://schemas.microsoft.com/office/drawing/2016/5/14/chartex" xmlns:mc="http://schemas.openxmlformats.org/markup-compatibility/2006" xmlns:aink="http://schemas.microsoft.com/office/drawing/2016/ink" xmlns:am3d="http://schemas.microsoft.com/office/drawing/2017/model3d" xmlns:o="urn:schemas-microsoft-com:office:office" xmlns:oel="http://schemas.microsoft.com/office/2019/extlst" xmlns:r="http://schemas.openxmlformats.org/officeDocument/2006/relationships" xmlns:m="http://schemas.openxmlformats.org/officeDocument/2006/math" xmlns:v="urn:schemas-microsoft-com:vml" xmlns:wp14="http://schemas.microsoft.com/office/word/2010/wordprocessingDrawing" xmlns:wp="http://schemas.openxmlformats.org/drawingml/2006/wordprocessingDrawing" xmlns:w10="urn:schemas-microsoft-com:office:word" xmlns:w="http://schemas.openxmlformats.org/wordprocessingml/2006/main" xmlns:w14="http://schemas.microsoft.com/office/word/2010/wordml" xmlns:w15="http://schemas.microsoft.com/office/word/2012/wordml" xmlns:w16cei="http://schemas.microsoft.com/office/word/2026/wordml/cei" xmlns:w16cex="http://schemas.microsoft.com/office/word/2018/wordml/cex" xmlns:w16cid="http://schemas.microsoft.com/office/word/2016/wordml/cid" xmlns:w16="http://schemas.microsoft.com/office/word/2018/wordml" xmlns:w16du="http://schemas.microsoft.com/office/word/2023/wordml/word16du" xmlns:w16sdtdh="http://schemas.microsoft.com/office/word/2020/wordml/sdtdatahash" xmlns:w16sdtfl="http://schemas.microsoft.com/office/word/2024/wordml/sdtformatlock" xmlns:w16se="http://schemas.microsoft.com/office/word/2015/wordml/symex" xmlns:wpg="http://schemas.microsoft.com/office/word/2010/wordprocessingGroup" xmlns:wpi="http://schemas.microsoft.com/office/word/2010/wordprocessingInk" xmlns:wne="http://schemas.microsoft.com/office/word/2006/wordml" xmlns:wps="http://schemas.microsoft.com/office/word/2010/wordprocessingShape" mc:Ignorable="w14 w15 w16se w16cid w16 w16cex w16sdtdh w16sdtfl w16du wp14">
   <w:endnote w:type="separator" w:id="-1">
     <w:p>
       <w:pPr>
@@ -1415,7 +1458,7 @@
 </file>
 
 <file path=word/footer1.xml><?xml version="1.0" encoding="utf-8"?>
-<w:ftr xmlns:wpc="http://schemas.microsoft.com/office/word/2010/wordprocessingCanvas" xmlns:cx="http://schemas.microsoft.com/office/drawing/2014/chartex" xmlns:cx1="http://schemas.microsoft.com/office/drawing/2015/9/8/chartex" xmlns:cx2="http://schemas.microsoft.com/office/drawing/2015/10/21/chartex" xmlns:cx3="http://schemas.microsoft.com/office/drawing/2016/5/9/chartex" xmlns:cx4="http://schemas.microsoft.com/office/drawing/2016/5/10/chartex" xmlns:cx5="http://schemas.microsoft.com/office/drawing/2016/5/11/chartex" xmlns:cx6="http://schemas.microsoft.com/office/drawing/2016/5/12/chartex" xmlns:cx7="http://schemas.microsoft.com/office/drawing/2016/5/13/chartex" xmlns:cx8="http://schemas.microsoft.com/office/drawing/2016/5/14/chartex" xmlns:mc="http://schemas.openxmlformats.org/markup-compatibility/2006" xmlns:aink="http://schemas.microsoft.com/office/drawing/2016/ink" xmlns:am3d="http://schemas.microsoft.com/office/drawing/2017/model3d" xmlns:o="urn:schemas-microsoft-com:office:office" xmlns:oel="http://schemas.microsoft.com/office/2019/extlst" xmlns:r="http://schemas.openxmlformats.org/officeDocument/2006/relationships" xmlns:m="http://schemas.openxmlformats.org/officeDocument/2006/math" xmlns:v="urn:schemas-microsoft-com:vml" xmlns:wp14="http://schemas.microsoft.com/office/word/2010/wordprocessingDrawing" xmlns:wp="http://schemas.openxmlformats.org/drawingml/2006/wordprocessingDrawing" xmlns:w10="urn:schemas-microsoft-com:office:word" xmlns:w="http://schemas.openxmlformats.org/wordprocessingml/2006/main" xmlns:w14="http://schemas.microsoft.com/office/word/2010/wordml" xmlns:w15="http://schemas.microsoft.com/office/word/2012/wordml" xmlns:w16cex="http://schemas.microsoft.com/office/word/2018/wordml/cex" xmlns:w16cid="http://schemas.microsoft.com/office/word/2016/wordml/cid" xmlns:w16="http://schemas.microsoft.com/office/word/2018/wordml" xmlns:w16du="http://schemas.microsoft.com/office/word/2023/wordml/word16du" xmlns:w16sdtdh="http://schemas.microsoft.com/office/word/2020/wordml/sdtdatahash" xmlns:w16sdtfl="http://schemas.microsoft.com/office/word/2024/wordml/sdtformatlock" xmlns:w16se="http://schemas.microsoft.com/office/word/2015/wordml/symex" xmlns:wpg="http://schemas.microsoft.com/office/word/2010/wordprocessingGroup" xmlns:wpi="http://schemas.microsoft.com/office/word/2010/wordprocessingInk" xmlns:wne="http://schemas.microsoft.com/office/word/2006/wordml" xmlns:wps="http://schemas.microsoft.com/office/word/2010/wordprocessingShape" mc:Ignorable="w14 w15 w16se w16cid w16 w16cex w16sdtdh w16sdtfl w16du wp14">
+<w:ftr xmlns:wpc="http://schemas.microsoft.com/office/word/2010/wordprocessingCanvas" xmlns:cx="http://schemas.microsoft.com/office/drawing/2014/chartex" xmlns:cx1="http://schemas.microsoft.com/office/drawing/2015/9/8/chartex" xmlns:cx2="http://schemas.microsoft.com/office/drawing/2015/10/21/chartex" xmlns:cx3="http://schemas.microsoft.com/office/drawing/2016/5/9/chartex" xmlns:cx4="http://schemas.microsoft.com/office/drawing/2016/5/10/chartex" xmlns:cx5="http://schemas.microsoft.com/office/drawing/2016/5/11/chartex" xmlns:cx6="http://schemas.microsoft.com/office/drawing/2016/5/12/chartex" xmlns:cx7="http://schemas.microsoft.com/office/drawing/2016/5/13/chartex" xmlns:cx8="http://schemas.microsoft.com/office/drawing/2016/5/14/chartex" xmlns:mc="http://schemas.openxmlformats.org/markup-compatibility/2006" xmlns:aink="http://schemas.microsoft.com/office/drawing/2016/ink" xmlns:am3d="http://schemas.microsoft.com/office/drawing/2017/model3d" xmlns:o="urn:schemas-microsoft-com:office:office" xmlns:oel="http://schemas.microsoft.com/office/2019/extlst" xmlns:r="http://schemas.openxmlformats.org/officeDocument/2006/relationships" xmlns:m="http://schemas.openxmlformats.org/officeDocument/2006/math" xmlns:v="urn:schemas-microsoft-com:vml" xmlns:wp14="http://schemas.microsoft.com/office/word/2010/wordprocessingDrawing" xmlns:wp="http://schemas.openxmlformats.org/drawingml/2006/wordprocessingDrawing" xmlns:w10="urn:schemas-microsoft-com:office:word" xmlns:w="http://schemas.openxmlformats.org/wordprocessingml/2006/main" xmlns:w14="http://schemas.microsoft.com/office/word/2010/wordml" xmlns:w15="http://schemas.microsoft.com/office/word/2012/wordml" xmlns:w16cei="http://schemas.microsoft.com/office/word/2026/wordml/cei" xmlns:w16cex="http://schemas.microsoft.com/office/word/2018/wordml/cex" xmlns:w16cid="http://schemas.microsoft.com/office/word/2016/wordml/cid" xmlns:w16="http://schemas.microsoft.com/office/word/2018/wordml" xmlns:w16du="http://schemas.microsoft.com/office/word/2023/wordml/word16du" xmlns:w16sdtdh="http://schemas.microsoft.com/office/word/2020/wordml/sdtdatahash" xmlns:w16sdtfl="http://schemas.microsoft.com/office/word/2024/wordml/sdtformatlock" xmlns:w16se="http://schemas.microsoft.com/office/word/2015/wordml/symex" xmlns:wpg="http://schemas.microsoft.com/office/word/2010/wordprocessingGroup" xmlns:wpi="http://schemas.microsoft.com/office/word/2010/wordprocessingInk" xmlns:wne="http://schemas.microsoft.com/office/word/2006/wordml" xmlns:wps="http://schemas.microsoft.com/office/word/2010/wordprocessingShape" mc:Ignorable="w14 w15 w16se w16cid w16 w16cex w16sdtdh w16sdtfl w16du wp14">
   <w:p>
     <w:pPr>
       <w:pBdr>
@@ -1427,7 +1470,7 @@
         <w:noProof/>
       </w:rPr>
       <w:drawing>
-        <wp:anchor distT="0" distB="0" distL="114300" distR="114300" simplePos="0" relativeHeight="251659264" behindDoc="0" locked="0" layoutInCell="1" allowOverlap="1" wp14:anchorId="4A8142CD" wp14:editId="6CB4EA88">
+        <wp:anchor distT="0" distB="0" distL="114300" distR="114300" simplePos="0" relativeHeight="251658241" behindDoc="0" locked="0" layoutInCell="1" allowOverlap="1" wp14:anchorId="4A8142CD" wp14:editId="6CB4EA88">
           <wp:simplePos x="0" y="0"/>
           <wp:positionH relativeFrom="column">
             <wp:posOffset>5351825</wp:posOffset>
@@ -1450,7 +1493,7 @@
                   <pic:cNvPicPr/>
                 </pic:nvPicPr>
                 <pic:blipFill rotWithShape="1">
-                  <a:blip r:embed="rIdTplImgC">
+                  <a:blip r:embed="rId1">
                     <a:extLst>
                       <a:ext uri="{28A0092B-C50C-407E-A947-70E740481C1C}">
                         <a14:useLocalDpi xmlns:a14="http://schemas.microsoft.com/office/drawing/2010/main" val="0"/>
@@ -1497,54 +1540,25 @@
         <w:sz w:val="16"/>
         <w:szCs w:val="16"/>
       </w:rPr>
-      <w:t>PARADISE-</w:t>
+      <w:t xml:space="preserve">PARADISE-studie  ·  eCRF 09: Meting </w:t>
     </w:r>
-    <w:proofErr w:type="gramStart"/>
+    <w:proofErr w:type="spellStart"/>
     <w:r>
       <w:rPr>
         <w:color w:val="59636E"/>
         <w:sz w:val="16"/>
         <w:szCs w:val="16"/>
       </w:rPr>
-      <w:t>studie  ·</w:t>
+      <w:t>plantaire</w:t>
     </w:r>
-    <w:proofErr w:type="gramEnd"/>
+    <w:proofErr w:type="spellEnd"/>
     <w:r>
       <w:rPr>
         <w:color w:val="59636E"/>
         <w:sz w:val="16"/>
         <w:szCs w:val="16"/>
       </w:rPr>
-      <w:t xml:space="preserve">  eCRF 09: Meting plantaire druk - baseline </w:t>
-    </w:r>
-    <w:proofErr w:type="gramStart"/>
-    <w:r>
-      <w:rPr>
-        <w:color w:val="59636E"/>
-        <w:sz w:val="16"/>
-        <w:szCs w:val="16"/>
-      </w:rPr>
-      <w:t>·</w:t>
-    </w:r>
-    <w:proofErr w:type="gramEnd"/>
-    <w:r>
-      <w:rPr>
-        <w:color w:val="59636E"/>
-        <w:sz w:val="16"/>
-        <w:szCs w:val="16"/>
-      </w:rPr>
-      <w:t xml:space="preserve">  Versie </w:t>
-    </w:r>
-    <w:proofErr w:type="gramStart"/>
-    <w:r>
-      <w:rPr>
-        <w:i/>
-        <w:iCs/>
-        <w:color w:val="59636E"/>
-        <w:sz w:val="16"/>
-        <w:szCs w:val="16"/>
-      </w:rPr>
-      <w:t xml:space="preserve">[ </w:t>
+      <w:t xml:space="preserve"> druk - baseline ·  Versie </w:t>
     </w:r>
     <w:r>
       <w:rPr>
@@ -1554,29 +1568,7 @@
         <w:sz w:val="16"/>
         <w:szCs w:val="16"/>
       </w:rPr>
-      <w:t>1.0</w:t>
-    </w:r>
-    <w:proofErr w:type="gramEnd"/>
-    <w:r>
-      <w:rPr>
-        <w:i/>
-        <w:iCs/>
-        <w:color w:val="59636E"/>
-        <w:sz w:val="16"/>
-        <w:szCs w:val="16"/>
-      </w:rPr>
-      <w:t xml:space="preserve"> </w:t>
-    </w:r>
-    <w:proofErr w:type="gramStart"/>
-    <w:r>
-      <w:rPr>
-        <w:i/>
-        <w:iCs/>
-        <w:color w:val="59636E"/>
-        <w:sz w:val="16"/>
-        <w:szCs w:val="16"/>
-      </w:rPr>
-      <w:t>]</w:t>
+      <w:t>[ 1.0 ]</w:t>
     </w:r>
     <w:r>
       <w:rPr>
@@ -1584,27 +1576,7 @@
         <w:sz w:val="16"/>
         <w:szCs w:val="16"/>
       </w:rPr>
-      <w:t xml:space="preserve">  ·</w:t>
-    </w:r>
-    <w:proofErr w:type="gramEnd"/>
-    <w:r>
-      <w:rPr>
-        <w:color w:val="59636E"/>
-        <w:sz w:val="16"/>
-        <w:szCs w:val="16"/>
-      </w:rPr>
-      <w:t xml:space="preserve">  </w:t>
-    </w:r>
-    <w:proofErr w:type="gramStart"/>
-    <w:r>
-      <w:rPr>
-        <w:i/>
-        <w:iCs/>
-        <w:color w:val="59636E"/>
-        <w:sz w:val="16"/>
-        <w:szCs w:val="16"/>
-      </w:rPr>
-      <w:t xml:space="preserve">[ </w:t>
+      <w:t xml:space="preserve">  ·  </w:t>
     </w:r>
     <w:r>
       <w:rPr>
@@ -1614,66 +1586,15 @@
         <w:sz w:val="16"/>
         <w:szCs w:val="16"/>
       </w:rPr>
-      <w:t>27</w:t>
+      <w:t>[ 27/07/2026 ]</w:t>
     </w:r>
-    <w:proofErr w:type="gramEnd"/>
-    <w:r>
-      <w:rPr>
-        <w:i/>
-        <w:iCs/>
-        <w:color w:val="59636E"/>
-        <w:sz w:val="16"/>
-        <w:szCs w:val="16"/>
-      </w:rPr>
-      <w:t>/07/</w:t>
-    </w:r>
-    <w:proofErr w:type="gramStart"/>
-    <w:r>
-      <w:rPr>
-        <w:i/>
-        <w:iCs/>
-        <w:color w:val="59636E"/>
-        <w:sz w:val="16"/>
-        <w:szCs w:val="16"/>
-      </w:rPr>
-      <w:t>2026</w:t>
-    </w:r>
-    <w:r>
-      <w:rPr>
-        <w:i/>
-        <w:iCs/>
-        <w:color w:val="59636E"/>
-        <w:sz w:val="16"/>
-        <w:szCs w:val="16"/>
-      </w:rPr>
-      <w:t xml:space="preserve"> ]</w:t>
-    </w:r>
-    <w:proofErr w:type="gramEnd"/>
     <w:r>
       <w:rPr>
         <w:color w:val="59636E"/>
         <w:sz w:val="16"/>
         <w:szCs w:val="16"/>
       </w:rPr>
-      <w:t xml:space="preserve">  </w:t>
-    </w:r>
-    <w:proofErr w:type="gramStart"/>
-    <w:r>
-      <w:rPr>
-        <w:color w:val="59636E"/>
-        <w:sz w:val="16"/>
-        <w:szCs w:val="16"/>
-      </w:rPr>
-      <w:t>·  Pagina</w:t>
-    </w:r>
-    <w:proofErr w:type="gramEnd"/>
-    <w:r>
-      <w:rPr>
-        <w:color w:val="59636E"/>
-        <w:sz w:val="16"/>
-        <w:szCs w:val="16"/>
-      </w:rPr>
-      <w:t xml:space="preserve"> </w:t>
+      <w:t xml:space="preserve">  ·  Pagina </w:t>
     </w:r>
     <w:r>
       <w:rPr>
@@ -1770,7 +1691,7 @@
 </file>
 
 <file path=word/footnotes.xml><?xml version="1.0" encoding="utf-8"?>
-<w:footnotes xmlns:wpc="http://schemas.microsoft.com/office/word/2010/wordprocessingCanvas" xmlns:cx="http://schemas.microsoft.com/office/drawing/2014/chartex" xmlns:cx1="http://schemas.microsoft.com/office/drawing/2015/9/8/chartex" xmlns:cx2="http://schemas.microsoft.com/office/drawing/2015/10/21/chartex" xmlns:cx3="http://schemas.microsoft.com/office/drawing/2016/5/9/chartex" xmlns:cx4="http://schemas.microsoft.com/office/drawing/2016/5/10/chartex" xmlns:cx5="http://schemas.microsoft.com/office/drawing/2016/5/11/chartex" xmlns:cx6="http://schemas.microsoft.com/office/drawing/2016/5/12/chartex" xmlns:cx7="http://schemas.microsoft.com/office/drawing/2016/5/13/chartex" xmlns:cx8="http://schemas.microsoft.com/office/drawing/2016/5/14/chartex" xmlns:mc="http://schemas.openxmlformats.org/markup-compatibility/2006" xmlns:aink="http://schemas.microsoft.com/office/drawing/2016/ink" xmlns:am3d="http://schemas.microsoft.com/office/drawing/2017/model3d" xmlns:o="urn:schemas-microsoft-com:office:office" xmlns:oel="http://schemas.microsoft.com/office/2019/extlst" xmlns:r="http://schemas.openxmlformats.org/officeDocument/2006/relationships" xmlns:m="http://schemas.openxmlformats.org/officeDocument/2006/math" xmlns:v="urn:schemas-microsoft-com:vml" xmlns:wp14="http://schemas.microsoft.com/office/word/2010/wordprocessingDrawing" xmlns:wp="http://schemas.openxmlformats.org/drawingml/2006/wordprocessingDrawing" xmlns:w10="urn:schemas-microsoft-com:office:word" xmlns:w="http://schemas.openxmlformats.org/wordprocessingml/2006/main" xmlns:w14="http://schemas.microsoft.com/office/word/2010/wordml" xmlns:w15="http://schemas.microsoft.com/office/word/2012/wordml" xmlns:w16cex="http://schemas.microsoft.com/office/word/2018/wordml/cex" xmlns:w16cid="http://schemas.microsoft.com/office/word/2016/wordml/cid" xmlns:w16="http://schemas.microsoft.com/office/word/2018/wordml" xmlns:w16du="http://schemas.microsoft.com/office/word/2023/wordml/word16du" xmlns:w16sdtdh="http://schemas.microsoft.com/office/word/2020/wordml/sdtdatahash" xmlns:w16sdtfl="http://schemas.microsoft.com/office/word/2024/wordml/sdtformatlock" xmlns:w16se="http://schemas.microsoft.com/office/word/2015/wordml/symex" xmlns:wpg="http://schemas.microsoft.com/office/word/2010/wordprocessingGroup" xmlns:wpi="http://schemas.microsoft.com/office/word/2010/wordprocessingInk" xmlns:wne="http://schemas.microsoft.com/office/word/2006/wordml" xmlns:wps="http://schemas.microsoft.com/office/word/2010/wordprocessingShape" mc:Ignorable="w14 w15 w16se w16cid w16 w16cex w16sdtdh w16sdtfl w16du wp14">
+<w:footnotes xmlns:wpc="http://schemas.microsoft.com/office/word/2010/wordprocessingCanvas" xmlns:cx="http://schemas.microsoft.com/office/drawing/2014/chartex" xmlns:cx1="http://schemas.microsoft.com/office/drawing/2015/9/8/chartex" xmlns:cx2="http://schemas.microsoft.com/office/drawing/2015/10/21/chartex" xmlns:cx3="http://schemas.microsoft.com/office/drawing/2016/5/9/chartex" xmlns:cx4="http://schemas.microsoft.com/office/drawing/2016/5/10/chartex" xmlns:cx5="http://schemas.microsoft.com/office/drawing/2016/5/11/chartex" xmlns:cx6="http://schemas.microsoft.com/office/drawing/2016/5/12/chartex" xmlns:cx7="http://schemas.microsoft.com/office/drawing/2016/5/13/chartex" xmlns:cx8="http://schemas.microsoft.com/office/drawing/2016/5/14/chartex" xmlns:mc="http://schemas.openxmlformats.org/markup-compatibility/2006" xmlns:aink="http://schemas.microsoft.com/office/drawing/2016/ink" xmlns:am3d="http://schemas.microsoft.com/office/drawing/2017/model3d" xmlns:o="urn:schemas-microsoft-com:office:office" xmlns:oel="http://schemas.microsoft.com/office/2019/extlst" xmlns:r="http://schemas.openxmlformats.org/officeDocument/2006/relationships" xmlns:m="http://schemas.openxmlformats.org/officeDocument/2006/math" xmlns:v="urn:schemas-microsoft-com:vml" xmlns:wp14="http://schemas.microsoft.com/office/word/2010/wordprocessingDrawing" xmlns:wp="http://schemas.openxmlformats.org/drawingml/2006/wordprocessingDrawing" xmlns:w10="urn:schemas-microsoft-com:office:word" xmlns:w="http://schemas.openxmlformats.org/wordprocessingml/2006/main" xmlns:w14="http://schemas.microsoft.com/office/word/2010/wordml" xmlns:w15="http://schemas.microsoft.com/office/word/2012/wordml" xmlns:w16cei="http://schemas.microsoft.com/office/word/2026/wordml/cei" xmlns:w16cex="http://schemas.microsoft.com/office/word/2018/wordml/cex" xmlns:w16cid="http://schemas.microsoft.com/office/word/2016/wordml/cid" xmlns:w16="http://schemas.microsoft.com/office/word/2018/wordml" xmlns:w16du="http://schemas.microsoft.com/office/word/2023/wordml/word16du" xmlns:w16sdtdh="http://schemas.microsoft.com/office/word/2020/wordml/sdtdatahash" xmlns:w16sdtfl="http://schemas.microsoft.com/office/word/2024/wordml/sdtformatlock" xmlns:w16se="http://schemas.microsoft.com/office/word/2015/wordml/symex" xmlns:wpg="http://schemas.microsoft.com/office/word/2010/wordprocessingGroup" xmlns:wpi="http://schemas.microsoft.com/office/word/2010/wordprocessingInk" xmlns:wne="http://schemas.microsoft.com/office/word/2006/wordml" xmlns:wps="http://schemas.microsoft.com/office/word/2010/wordprocessingShape" mc:Ignorable="w14 w15 w16se w16cid w16 w16cex w16sdtdh w16sdtfl w16du wp14">
   <w:footnote w:type="separator" w:id="-1">
     <w:p>
       <w:pPr>
@@ -1789,10 +1710,9 @@
 </file>
 
 <file path=word/header1.xml><?xml version="1.0" encoding="utf-8"?>
-<w:hdr xmlns:wpc="http://schemas.microsoft.com/office/word/2010/wordprocessingCanvas" xmlns:cx="http://schemas.microsoft.com/office/drawing/2014/chartex" xmlns:cx1="http://schemas.microsoft.com/office/drawing/2015/9/8/chartex" xmlns:cx2="http://schemas.microsoft.com/office/drawing/2015/10/21/chartex" xmlns:cx3="http://schemas.microsoft.com/office/drawing/2016/5/9/chartex" xmlns:cx4="http://schemas.microsoft.com/office/drawing/2016/5/10/chartex" xmlns:cx5="http://schemas.microsoft.com/office/drawing/2016/5/11/chartex" xmlns:cx6="http://schemas.microsoft.com/office/drawing/2016/5/12/chartex" xmlns:cx7="http://schemas.microsoft.com/office/drawing/2016/5/13/chartex" xmlns:cx8="http://schemas.microsoft.com/office/drawing/2016/5/14/chartex" xmlns:mc="http://schemas.openxmlformats.org/markup-compatibility/2006" xmlns:aink="http://schemas.microsoft.com/office/drawing/2016/ink" xmlns:am3d="http://schemas.microsoft.com/office/drawing/2017/model3d" xmlns:o="urn:schemas-microsoft-com:office:office" xmlns:oel="http://schemas.microsoft.com/office/2019/extlst" xmlns:r="http://schemas.openxmlformats.org/officeDocument/2006/relationships" xmlns:m="http://schemas.openxmlformats.org/officeDocument/2006/math" xmlns:v="urn:schemas-microsoft-com:vml" xmlns:wp14="http://schemas.microsoft.com/office/word/2010/wordprocessingDrawing" xmlns:wp="http://schemas.openxmlformats.org/drawingml/2006/wordprocessingDrawing" xmlns:w10="urn:schemas-microsoft-com:office:word" xmlns:w="http://schemas.openxmlformats.org/wordprocessingml/2006/main" xmlns:w14="http://schemas.microsoft.com/office/word/2010/wordml" xmlns:w15="http://schemas.microsoft.com/office/word/2012/wordml" xmlns:w16cex="http://schemas.microsoft.com/office/word/2018/wordml/cex" xmlns:w16cid="http://schemas.microsoft.com/office/word/2016/wordml/cid" xmlns:w16="http://schemas.microsoft.com/office/word/2018/wordml" xmlns:w16du="http://schemas.microsoft.com/office/word/2023/wordml/word16du" xmlns:w16sdtdh="http://schemas.microsoft.com/office/word/2020/wordml/sdtdatahash" xmlns:w16sdtfl="http://schemas.microsoft.com/office/word/2024/wordml/sdtformatlock" xmlns:w16se="http://schemas.microsoft.com/office/word/2015/wordml/symex" xmlns:wpg="http://schemas.microsoft.com/office/word/2010/wordprocessingGroup" xmlns:wpi="http://schemas.microsoft.com/office/word/2010/wordprocessingInk" xmlns:wne="http://schemas.microsoft.com/office/word/2006/wordml" xmlns:wps="http://schemas.microsoft.com/office/word/2010/wordprocessingShape" mc:Ignorable="w14 w15 w16se w16cid w16 w16cex w16sdtdh w16sdtfl w16du wp14">
+<w:hdr xmlns:wpc="http://schemas.microsoft.com/office/word/2010/wordprocessingCanvas" xmlns:cx="http://schemas.microsoft.com/office/drawing/2014/chartex" xmlns:cx1="http://schemas.microsoft.com/office/drawing/2015/9/8/chartex" xmlns:cx2="http://schemas.microsoft.com/office/drawing/2015/10/21/chartex" xmlns:cx3="http://schemas.microsoft.com/office/drawing/2016/5/9/chartex" xmlns:cx4="http://schemas.microsoft.com/office/drawing/2016/5/10/chartex" xmlns:cx5="http://schemas.microsoft.com/office/drawing/2016/5/11/chartex" xmlns:cx6="http://schemas.microsoft.com/office/drawing/2016/5/12/chartex" xmlns:cx7="http://schemas.microsoft.com/office/drawing/2016/5/13/chartex" xmlns:cx8="http://schemas.microsoft.com/office/drawing/2016/5/14/chartex" xmlns:mc="http://schemas.openxmlformats.org/markup-compatibility/2006" xmlns:aink="http://schemas.microsoft.com/office/drawing/2016/ink" xmlns:am3d="http://schemas.microsoft.com/office/drawing/2017/model3d" xmlns:o="urn:schemas-microsoft-com:office:office" xmlns:oel="http://schemas.microsoft.com/office/2019/extlst" xmlns:r="http://schemas.openxmlformats.org/officeDocument/2006/relationships" xmlns:m="http://schemas.openxmlformats.org/officeDocument/2006/math" xmlns:v="urn:schemas-microsoft-com:vml" xmlns:wp14="http://schemas.microsoft.com/office/word/2010/wordprocessingDrawing" xmlns:wp="http://schemas.openxmlformats.org/drawingml/2006/wordprocessingDrawing" xmlns:w10="urn:schemas-microsoft-com:office:word" xmlns:w="http://schemas.openxmlformats.org/wordprocessingml/2006/main" xmlns:w14="http://schemas.microsoft.com/office/word/2010/wordml" xmlns:w15="http://schemas.microsoft.com/office/word/2012/wordml" xmlns:w16cei="http://schemas.microsoft.com/office/word/2026/wordml/cei" xmlns:w16cex="http://schemas.microsoft.com/office/word/2018/wordml/cex" xmlns:w16cid="http://schemas.microsoft.com/office/word/2016/wordml/cid" xmlns:w16="http://schemas.microsoft.com/office/word/2018/wordml" xmlns:w16du="http://schemas.microsoft.com/office/word/2023/wordml/word16du" xmlns:w16sdtdh="http://schemas.microsoft.com/office/word/2020/wordml/sdtdatahash" xmlns:w16sdtfl="http://schemas.microsoft.com/office/word/2024/wordml/sdtformatlock" xmlns:w16se="http://schemas.microsoft.com/office/word/2015/wordml/symex" xmlns:wpg="http://schemas.microsoft.com/office/word/2010/wordprocessingGroup" xmlns:wpi="http://schemas.microsoft.com/office/word/2010/wordprocessingInk" xmlns:wne="http://schemas.microsoft.com/office/word/2006/wordml" xmlns:wps="http://schemas.microsoft.com/office/word/2010/wordprocessingShape" mc:Ignorable="w14 w15 w16se w16cid w16 w16cex w16sdtdh w16sdtfl w16du wp14">
   <w:p>
     <w:pPr>
-      <w:pStyle w:val="Koptekst"/>
       <w:jc w:val="right"/>
     </w:pPr>
     <w:r>
@@ -1836,7 +1756,7 @@
                   <pic:cNvPicPr/>
                 </pic:nvPicPr>
                 <pic:blipFill>
-                  <a:blip r:embed="rIdTplImgA">
+                  <a:blip r:embed="rId1">
                     <a:extLst>
                       <a:ext uri="{28A0092B-C50C-407E-A947-70E740481C1C}">
                         <a14:useLocalDpi xmlns:a14="http://schemas.microsoft.com/office/drawing/2010/main" val="0"/>
@@ -1888,7 +1808,7 @@
                   <pic:cNvPicPr/>
                 </pic:nvPicPr>
                 <pic:blipFill>
-                  <a:blip r:embed="rIdTplImgB">
+                  <a:blip r:embed="rId2">
                     <a:extLst>
                       <a:ext uri="{28A0092B-C50C-407E-A947-70E740481C1C}">
                         <a14:useLocalDpi xmlns:a14="http://schemas.microsoft.com/office/drawing/2010/main" val="0"/>
@@ -1919,8 +1839,157 @@
 </file>
 
 <file path=word/numbering.xml><?xml version="1.0" encoding="utf-8"?>
-<w:numbering xmlns:wpc="http://schemas.microsoft.com/office/word/2010/wordprocessingCanvas" xmlns:cx="http://schemas.microsoft.com/office/drawing/2014/chartex" xmlns:cx1="http://schemas.microsoft.com/office/drawing/2015/9/8/chartex" xmlns:cx2="http://schemas.microsoft.com/office/drawing/2015/10/21/chartex" xmlns:cx3="http://schemas.microsoft.com/office/drawing/2016/5/9/chartex" xmlns:cx4="http://schemas.microsoft.com/office/drawing/2016/5/10/chartex" xmlns:cx5="http://schemas.microsoft.com/office/drawing/2016/5/11/chartex" xmlns:cx6="http://schemas.microsoft.com/office/drawing/2016/5/12/chartex" xmlns:cx7="http://schemas.microsoft.com/office/drawing/2016/5/13/chartex" xmlns:cx8="http://schemas.microsoft.com/office/drawing/2016/5/14/chartex" xmlns:mc="http://schemas.openxmlformats.org/markup-compatibility/2006" xmlns:aink="http://schemas.microsoft.com/office/drawing/2016/ink" xmlns:am3d="http://schemas.microsoft.com/office/drawing/2017/model3d" xmlns:o="urn:schemas-microsoft-com:office:office" xmlns:oel="http://schemas.microsoft.com/office/2019/extlst" xmlns:r="http://schemas.openxmlformats.org/officeDocument/2006/relationships" xmlns:m="http://schemas.openxmlformats.org/officeDocument/2006/math" xmlns:v="urn:schemas-microsoft-com:vml" xmlns:wp14="http://schemas.microsoft.com/office/word/2010/wordprocessingDrawing" xmlns:wp="http://schemas.openxmlformats.org/drawingml/2006/wordprocessingDrawing" xmlns:w10="urn:schemas-microsoft-com:office:word" xmlns:w="http://schemas.openxmlformats.org/wordprocessingml/2006/main" xmlns:w14="http://schemas.microsoft.com/office/word/2010/wordml" xmlns:w15="http://schemas.microsoft.com/office/word/2012/wordml" xmlns:w16cex="http://schemas.microsoft.com/office/word/2018/wordml/cex" xmlns:w16cid="http://schemas.microsoft.com/office/word/2016/wordml/cid" xmlns:w16="http://schemas.microsoft.com/office/word/2018/wordml" xmlns:w16du="http://schemas.microsoft.com/office/word/2023/wordml/word16du" xmlns:w16sdtdh="http://schemas.microsoft.com/office/word/2020/wordml/sdtdatahash" xmlns:w16sdtfl="http://schemas.microsoft.com/office/word/2024/wordml/sdtformatlock" xmlns:w16se="http://schemas.microsoft.com/office/word/2015/wordml/symex" xmlns:wpg="http://schemas.microsoft.com/office/word/2010/wordprocessingGroup" xmlns:wpi="http://schemas.microsoft.com/office/word/2010/wordprocessingInk" xmlns:wne="http://schemas.microsoft.com/office/word/2006/wordml" xmlns:wps="http://schemas.microsoft.com/office/word/2010/wordprocessingShape" mc:Ignorable="w14 w15 w16se w16cid w16 w16cex w16sdtdh w16sdtfl w16du wp14">
+<w:numbering xmlns:wpc="http://schemas.microsoft.com/office/word/2010/wordprocessingCanvas" xmlns:cx="http://schemas.microsoft.com/office/drawing/2014/chartex" xmlns:cx1="http://schemas.microsoft.com/office/drawing/2015/9/8/chartex" xmlns:cx2="http://schemas.microsoft.com/office/drawing/2015/10/21/chartex" xmlns:cx3="http://schemas.microsoft.com/office/drawing/2016/5/9/chartex" xmlns:cx4="http://schemas.microsoft.com/office/drawing/2016/5/10/chartex" xmlns:cx5="http://schemas.microsoft.com/office/drawing/2016/5/11/chartex" xmlns:cx6="http://schemas.microsoft.com/office/drawing/2016/5/12/chartex" xmlns:cx7="http://schemas.microsoft.com/office/drawing/2016/5/13/chartex" xmlns:cx8="http://schemas.microsoft.com/office/drawing/2016/5/14/chartex" xmlns:mc="http://schemas.openxmlformats.org/markup-compatibility/2006" xmlns:aink="http://schemas.microsoft.com/office/drawing/2016/ink" xmlns:am3d="http://schemas.microsoft.com/office/drawing/2017/model3d" xmlns:o="urn:schemas-microsoft-com:office:office" xmlns:oel="http://schemas.microsoft.com/office/2019/extlst" xmlns:r="http://schemas.openxmlformats.org/officeDocument/2006/relationships" xmlns:m="http://schemas.openxmlformats.org/officeDocument/2006/math" xmlns:v="urn:schemas-microsoft-com:vml" xmlns:wp14="http://schemas.microsoft.com/office/word/2010/wordprocessingDrawing" xmlns:wp="http://schemas.openxmlformats.org/drawingml/2006/wordprocessingDrawing" xmlns:w10="urn:schemas-microsoft-com:office:word" xmlns:w="http://schemas.openxmlformats.org/wordprocessingml/2006/main" xmlns:w14="http://schemas.microsoft.com/office/word/2010/wordml" xmlns:w15="http://schemas.microsoft.com/office/word/2012/wordml" xmlns:w16cei="http://schemas.microsoft.com/office/word/2026/wordml/cei" xmlns:w16cex="http://schemas.microsoft.com/office/word/2018/wordml/cex" xmlns:w16cid="http://schemas.microsoft.com/office/word/2016/wordml/cid" xmlns:w16="http://schemas.microsoft.com/office/word/2018/wordml" xmlns:w16du="http://schemas.microsoft.com/office/word/2023/wordml/word16du" xmlns:w16sdtdh="http://schemas.microsoft.com/office/word/2020/wordml/sdtdatahash" xmlns:w16sdtfl="http://schemas.microsoft.com/office/word/2024/wordml/sdtformatlock" xmlns:w16se="http://schemas.microsoft.com/office/word/2015/wordml/symex" xmlns:wpg="http://schemas.microsoft.com/office/word/2010/wordprocessingGroup" xmlns:wpi="http://schemas.microsoft.com/office/word/2010/wordprocessingInk" xmlns:wne="http://schemas.microsoft.com/office/word/2006/wordml" xmlns:wps="http://schemas.microsoft.com/office/word/2010/wordprocessingShape" mc:Ignorable="w14 w15 w16se w16cid w16 w16cex w16sdtdh w16sdtfl w16du wp14">
   <w:abstractNum w:abstractNumId="0" w15:restartNumberingAfterBreak="0">
+    <w:nsid w:val="308B0DDF"/>
+    <w:multiLevelType w:val="multilevel"/>
+    <w:tmpl w:val="B712BA32"/>
+    <w:lvl w:ilvl="0">
+      <w:start w:val="1"/>
+      <w:numFmt w:val="bullet"/>
+      <w:lvlText w:val=""/>
+      <w:lvlJc w:val="left"/>
+      <w:pPr>
+        <w:tabs>
+          <w:tab w:val="num" w:pos="720"/>
+        </w:tabs>
+        <w:ind w:left="720" w:hanging="360"/>
+      </w:pPr>
+      <w:rPr>
+        <w:rFonts w:ascii="Symbol" w:hAnsi="Symbol" w:hint="default"/>
+        <w:sz w:val="20"/>
+      </w:rPr>
+    </w:lvl>
+    <w:lvl w:ilvl="1">
+      <w:start w:val="1"/>
+      <w:numFmt w:val="bullet"/>
+      <w:lvlText w:val="o"/>
+      <w:lvlJc w:val="left"/>
+      <w:pPr>
+        <w:tabs>
+          <w:tab w:val="num" w:pos="1440"/>
+        </w:tabs>
+        <w:ind w:left="1440" w:hanging="360"/>
+      </w:pPr>
+      <w:rPr>
+        <w:rFonts w:ascii="Courier New" w:hAnsi="Courier New" w:cs="Times New Roman" w:hint="default"/>
+        <w:sz w:val="20"/>
+      </w:rPr>
+    </w:lvl>
+    <w:lvl w:ilvl="2">
+      <w:start w:val="1"/>
+      <w:numFmt w:val="bullet"/>
+      <w:lvlText w:val=""/>
+      <w:lvlJc w:val="left"/>
+      <w:pPr>
+        <w:tabs>
+          <w:tab w:val="num" w:pos="2160"/>
+        </w:tabs>
+        <w:ind w:left="2160" w:hanging="360"/>
+      </w:pPr>
+      <w:rPr>
+        <w:rFonts w:ascii="Wingdings" w:hAnsi="Wingdings" w:hint="default"/>
+        <w:sz w:val="20"/>
+      </w:rPr>
+    </w:lvl>
+    <w:lvl w:ilvl="3">
+      <w:start w:val="1"/>
+      <w:numFmt w:val="bullet"/>
+      <w:lvlText w:val=""/>
+      <w:lvlJc w:val="left"/>
+      <w:pPr>
+        <w:tabs>
+          <w:tab w:val="num" w:pos="2880"/>
+        </w:tabs>
+        <w:ind w:left="2880" w:hanging="360"/>
+      </w:pPr>
+      <w:rPr>
+        <w:rFonts w:ascii="Wingdings" w:hAnsi="Wingdings" w:hint="default"/>
+        <w:sz w:val="20"/>
+      </w:rPr>
+    </w:lvl>
+    <w:lvl w:ilvl="4">
+      <w:start w:val="1"/>
+      <w:numFmt w:val="bullet"/>
+      <w:lvlText w:val=""/>
+      <w:lvlJc w:val="left"/>
+      <w:pPr>
+        <w:tabs>
+          <w:tab w:val="num" w:pos="3600"/>
+        </w:tabs>
+        <w:ind w:left="3600" w:hanging="360"/>
+      </w:pPr>
+      <w:rPr>
+        <w:rFonts w:ascii="Wingdings" w:hAnsi="Wingdings" w:hint="default"/>
+        <w:sz w:val="20"/>
+      </w:rPr>
+    </w:lvl>
+    <w:lvl w:ilvl="5">
+      <w:start w:val="1"/>
+      <w:numFmt w:val="bullet"/>
+      <w:lvlText w:val=""/>
+      <w:lvlJc w:val="left"/>
+      <w:pPr>
+        <w:tabs>
+          <w:tab w:val="num" w:pos="4320"/>
+        </w:tabs>
+        <w:ind w:left="4320" w:hanging="360"/>
+      </w:pPr>
+      <w:rPr>
+        <w:rFonts w:ascii="Wingdings" w:hAnsi="Wingdings" w:hint="default"/>
+        <w:sz w:val="20"/>
+      </w:rPr>
+    </w:lvl>
+    <w:lvl w:ilvl="6">
+      <w:start w:val="1"/>
+      <w:numFmt w:val="bullet"/>
+      <w:lvlText w:val=""/>
+      <w:lvlJc w:val="left"/>
+      <w:pPr>
+        <w:tabs>
+          <w:tab w:val="num" w:pos="5040"/>
+        </w:tabs>
+        <w:ind w:left="5040" w:hanging="360"/>
+      </w:pPr>
+      <w:rPr>
+        <w:rFonts w:ascii="Wingdings" w:hAnsi="Wingdings" w:hint="default"/>
+        <w:sz w:val="20"/>
+      </w:rPr>
+    </w:lvl>
+    <w:lvl w:ilvl="7">
+      <w:start w:val="1"/>
+      <w:numFmt w:val="bullet"/>
+      <w:lvlText w:val=""/>
+      <w:lvlJc w:val="left"/>
+      <w:pPr>
+        <w:tabs>
+          <w:tab w:val="num" w:pos="5760"/>
+        </w:tabs>
+        <w:ind w:left="5760" w:hanging="360"/>
+      </w:pPr>
+      <w:rPr>
+        <w:rFonts w:ascii="Wingdings" w:hAnsi="Wingdings" w:hint="default"/>
+        <w:sz w:val="20"/>
+      </w:rPr>
+    </w:lvl>
+    <w:lvl w:ilvl="8">
+      <w:start w:val="1"/>
+      <w:numFmt w:val="bullet"/>
+      <w:lvlText w:val=""/>
+      <w:lvlJc w:val="left"/>
+      <w:pPr>
+        <w:tabs>
+          <w:tab w:val="num" w:pos="6480"/>
+        </w:tabs>
+        <w:ind w:left="6480" w:hanging="360"/>
+      </w:pPr>
+      <w:rPr>
+        <w:rFonts w:ascii="Wingdings" w:hAnsi="Wingdings" w:hint="default"/>
+        <w:sz w:val="20"/>
+      </w:rPr>
+    </w:lvl>
+  </w:abstractNum>
+  <w:abstractNum w:abstractNumId="1" w15:restartNumberingAfterBreak="0">
     <w:nsid w:val="516D0CF6"/>
     <w:multiLevelType w:val="hybridMultilevel"/>
     <w:tmpl w:val="2E443618"/>
@@ -2010,17 +2079,29 @@
     </w:lvl>
   </w:abstractNum>
   <w:num w:numId="1" w16cid:durableId="1794711100">
+    <w:abstractNumId w:val="1"/>
+  </w:num>
+  <w:num w:numId="2" w16cid:durableId="883757182">
     <w:abstractNumId w:val="0"/>
+    <w:lvlOverride w:ilvl="0"/>
+    <w:lvlOverride w:ilvl="1"/>
+    <w:lvlOverride w:ilvl="2"/>
+    <w:lvlOverride w:ilvl="3"/>
+    <w:lvlOverride w:ilvl="4"/>
+    <w:lvlOverride w:ilvl="5"/>
+    <w:lvlOverride w:ilvl="6"/>
+    <w:lvlOverride w:ilvl="7"/>
+    <w:lvlOverride w:ilvl="8"/>
   </w:num>
 </w:numbering>
 </file>
 
 <file path=word/styles.xml><?xml version="1.0" encoding="utf-8"?>
-<w:styles xmlns:wp14="http://schemas.microsoft.com/office/word/2010/wordprocessingDrawing" xmlns:mc="http://schemas.openxmlformats.org/markup-compatibility/2006" xmlns:r="http://schemas.openxmlformats.org/officeDocument/2006/relationships" xmlns:w="http://schemas.openxmlformats.org/wordprocessingml/2006/main" xmlns:w14="http://schemas.microsoft.com/office/word/2010/wordml" xmlns:w15="http://schemas.microsoft.com/office/word/2012/wordml" xmlns:w16cex="http://schemas.microsoft.com/office/word/2018/wordml/cex" xmlns:w16cid="http://schemas.microsoft.com/office/word/2016/wordml/cid" xmlns:w16="http://schemas.microsoft.com/office/word/2018/wordml" xmlns:w16du="http://schemas.microsoft.com/office/word/2023/wordml/word16du" xmlns:w16sdtdh="http://schemas.microsoft.com/office/word/2020/wordml/sdtdatahash" xmlns:w16sdtfl="http://schemas.microsoft.com/office/word/2024/wordml/sdtformatlock" xmlns:w16se="http://schemas.microsoft.com/office/word/2015/wordml/symex" mc:Ignorable="w14 w15 w16se w16cid w16 w16cex w16sdtdh w16sdtfl w16du wp14">
+<w:styles xmlns:mc="http://schemas.openxmlformats.org/markup-compatibility/2006" xmlns:r="http://schemas.openxmlformats.org/officeDocument/2006/relationships" xmlns:w="http://schemas.openxmlformats.org/wordprocessingml/2006/main" xmlns:w14="http://schemas.microsoft.com/office/word/2010/wordml" xmlns:w15="http://schemas.microsoft.com/office/word/2012/wordml" xmlns:w16cex="http://schemas.microsoft.com/office/word/2018/wordml/cex" xmlns:w16cid="http://schemas.microsoft.com/office/word/2016/wordml/cid" xmlns:w16="http://schemas.microsoft.com/office/word/2018/wordml" xmlns:w16du="http://schemas.microsoft.com/office/word/2023/wordml/word16du" xmlns:w16sdtdh="http://schemas.microsoft.com/office/word/2020/wordml/sdtdatahash" xmlns:w16sdtfl="http://schemas.microsoft.com/office/word/2024/wordml/sdtformatlock" xmlns:w16se="http://schemas.microsoft.com/office/word/2015/wordml/symex" mc:Ignorable="w14 w15 w16se w16cid w16 w16cex w16sdtdh w16sdtfl w16du">
   <w:docDefaults>
     <w:rPrDefault>
       <w:rPr>
-        <w:rFonts w:asciiTheme="minorHAnsi" w:hAnsiTheme="minorHAnsi" w:eastAsiaTheme="minorHAnsi" w:cstheme="minorBidi"/>
+        <w:rFonts w:asciiTheme="minorHAnsi" w:eastAsiaTheme="minorHAnsi" w:hAnsiTheme="minorHAnsi" w:cstheme="minorBidi"/>
         <w:kern w:val="2"/>
         <w:sz w:val="24"/>
         <w:szCs w:val="24"/>
@@ -2037,14 +2118,14 @@
   <w:latentStyles w:defLockedState="0" w:defUIPriority="99" w:defSemiHidden="0" w:defUnhideWhenUsed="0" w:defQFormat="0" w:count="376">
     <w:lsdException w:name="Normal" w:uiPriority="0" w:qFormat="1"/>
     <w:lsdException w:name="heading 1" w:uiPriority="9" w:qFormat="1"/>
-    <w:lsdException w:name="heading 2" w:uiPriority="9" w:semiHidden="1" w:unhideWhenUsed="1" w:qFormat="1"/>
-    <w:lsdException w:name="heading 3" w:uiPriority="9" w:semiHidden="1" w:unhideWhenUsed="1" w:qFormat="1"/>
-    <w:lsdException w:name="heading 4" w:uiPriority="9" w:semiHidden="1" w:unhideWhenUsed="1" w:qFormat="1"/>
-    <w:lsdException w:name="heading 5" w:uiPriority="9" w:semiHidden="1" w:unhideWhenUsed="1" w:qFormat="1"/>
-    <w:lsdException w:name="heading 6" w:uiPriority="9" w:semiHidden="1" w:unhideWhenUsed="1" w:qFormat="1"/>
-    <w:lsdException w:name="heading 7" w:uiPriority="9" w:semiHidden="1" w:unhideWhenUsed="1" w:qFormat="1"/>
-    <w:lsdException w:name="heading 8" w:uiPriority="9" w:semiHidden="1" w:unhideWhenUsed="1" w:qFormat="1"/>
-    <w:lsdException w:name="heading 9" w:uiPriority="9" w:semiHidden="1" w:unhideWhenUsed="1" w:qFormat="1"/>
+    <w:lsdException w:name="heading 2" w:semiHidden="1" w:uiPriority="9" w:unhideWhenUsed="1" w:qFormat="1"/>
+    <w:lsdException w:name="heading 3" w:semiHidden="1" w:uiPriority="9" w:unhideWhenUsed="1" w:qFormat="1"/>
+    <w:lsdException w:name="heading 4" w:semiHidden="1" w:uiPriority="9" w:unhideWhenUsed="1" w:qFormat="1"/>
+    <w:lsdException w:name="heading 5" w:semiHidden="1" w:uiPriority="9" w:unhideWhenUsed="1" w:qFormat="1"/>
+    <w:lsdException w:name="heading 6" w:semiHidden="1" w:uiPriority="9" w:unhideWhenUsed="1" w:qFormat="1"/>
+    <w:lsdException w:name="heading 7" w:semiHidden="1" w:uiPriority="9" w:unhideWhenUsed="1" w:qFormat="1"/>
+    <w:lsdException w:name="heading 8" w:semiHidden="1" w:uiPriority="9" w:unhideWhenUsed="1" w:qFormat="1"/>
+    <w:lsdException w:name="heading 9" w:semiHidden="1" w:uiPriority="9" w:unhideWhenUsed="1" w:qFormat="1"/>
     <w:lsdException w:name="index 1" w:semiHidden="1" w:unhideWhenUsed="1"/>
     <w:lsdException w:name="index 2" w:semiHidden="1" w:unhideWhenUsed="1"/>
     <w:lsdException w:name="index 3" w:semiHidden="1" w:unhideWhenUsed="1"/>
@@ -2054,22 +2135,22 @@
     <w:lsdException w:name="index 7" w:semiHidden="1" w:unhideWhenUsed="1"/>
     <w:lsdException w:name="index 8" w:semiHidden="1" w:unhideWhenUsed="1"/>
     <w:lsdException w:name="index 9" w:semiHidden="1" w:unhideWhenUsed="1"/>
-    <w:lsdException w:name="toc 1" w:uiPriority="39" w:semiHidden="1" w:unhideWhenUsed="1"/>
-    <w:lsdException w:name="toc 2" w:uiPriority="39" w:semiHidden="1" w:unhideWhenUsed="1"/>
-    <w:lsdException w:name="toc 3" w:uiPriority="39" w:semiHidden="1" w:unhideWhenUsed="1"/>
-    <w:lsdException w:name="toc 4" w:uiPriority="39" w:semiHidden="1" w:unhideWhenUsed="1"/>
-    <w:lsdException w:name="toc 5" w:uiPriority="39" w:semiHidden="1" w:unhideWhenUsed="1"/>
-    <w:lsdException w:name="toc 6" w:uiPriority="39" w:semiHidden="1" w:unhideWhenUsed="1"/>
-    <w:lsdException w:name="toc 7" w:uiPriority="39" w:semiHidden="1" w:unhideWhenUsed="1"/>
-    <w:lsdException w:name="toc 8" w:uiPriority="39" w:semiHidden="1" w:unhideWhenUsed="1"/>
-    <w:lsdException w:name="toc 9" w:uiPriority="39" w:semiHidden="1" w:unhideWhenUsed="1"/>
+    <w:lsdException w:name="toc 1" w:semiHidden="1" w:uiPriority="39" w:unhideWhenUsed="1"/>
+    <w:lsdException w:name="toc 2" w:semiHidden="1" w:uiPriority="39" w:unhideWhenUsed="1"/>
+    <w:lsdException w:name="toc 3" w:semiHidden="1" w:uiPriority="39" w:unhideWhenUsed="1"/>
+    <w:lsdException w:name="toc 4" w:semiHidden="1" w:uiPriority="39" w:unhideWhenUsed="1"/>
+    <w:lsdException w:name="toc 5" w:semiHidden="1" w:uiPriority="39" w:unhideWhenUsed="1"/>
+    <w:lsdException w:name="toc 6" w:semiHidden="1" w:uiPriority="39" w:unhideWhenUsed="1"/>
+    <w:lsdException w:name="toc 7" w:semiHidden="1" w:uiPriority="39" w:unhideWhenUsed="1"/>
+    <w:lsdException w:name="toc 8" w:semiHidden="1" w:uiPriority="39" w:unhideWhenUsed="1"/>
+    <w:lsdException w:name="toc 9" w:semiHidden="1" w:uiPriority="39" w:unhideWhenUsed="1"/>
     <w:lsdException w:name="Normal Indent" w:semiHidden="1" w:unhideWhenUsed="1"/>
     <w:lsdException w:name="footnote text" w:semiHidden="1" w:unhideWhenUsed="1"/>
     <w:lsdException w:name="annotation text" w:semiHidden="1" w:unhideWhenUsed="1"/>
     <w:lsdException w:name="header" w:semiHidden="1" w:unhideWhenUsed="1"/>
     <w:lsdException w:name="footer" w:semiHidden="1" w:unhideWhenUsed="1"/>
     <w:lsdException w:name="index heading" w:semiHidden="1" w:unhideWhenUsed="1"/>
-    <w:lsdException w:name="caption" w:uiPriority="35" w:semiHidden="1" w:unhideWhenUsed="1" w:qFormat="1"/>
+    <w:lsdException w:name="caption" w:semiHidden="1" w:uiPriority="35" w:unhideWhenUsed="1" w:qFormat="1"/>
     <w:lsdException w:name="table of figures" w:semiHidden="1" w:unhideWhenUsed="1"/>
     <w:lsdException w:name="envelope address" w:semiHidden="1" w:unhideWhenUsed="1"/>
     <w:lsdException w:name="envelope return" w:semiHidden="1" w:unhideWhenUsed="1"/>
@@ -2100,7 +2181,7 @@
     <w:lsdException w:name="Title" w:uiPriority="10" w:qFormat="1"/>
     <w:lsdException w:name="Closing" w:semiHidden="1" w:unhideWhenUsed="1"/>
     <w:lsdException w:name="Signature" w:semiHidden="1" w:unhideWhenUsed="1"/>
-    <w:lsdException w:name="Default Paragraph Font" w:uiPriority="1" w:semiHidden="1" w:unhideWhenUsed="1"/>
+    <w:lsdException w:name="Default Paragraph Font" w:semiHidden="1" w:uiPriority="1" w:unhideWhenUsed="1"/>
     <w:lsdException w:name="Body Text" w:semiHidden="1" w:unhideWhenUsed="1"/>
     <w:lsdException w:name="Body Text Indent" w:semiHidden="1" w:unhideWhenUsed="1"/>
     <w:lsdException w:name="List Continue" w:semiHidden="1" w:unhideWhenUsed="1"/>
@@ -2300,8 +2381,8 @@
     <w:lsdException w:name="Subtle Reference" w:uiPriority="31" w:qFormat="1"/>
     <w:lsdException w:name="Intense Reference" w:uiPriority="32" w:qFormat="1"/>
     <w:lsdException w:name="Book Title" w:uiPriority="33" w:qFormat="1"/>
-    <w:lsdException w:name="Bibliography" w:uiPriority="37" w:semiHidden="1" w:unhideWhenUsed="1"/>
-    <w:lsdException w:name="TOC Heading" w:uiPriority="39" w:semiHidden="1" w:unhideWhenUsed="1" w:qFormat="1"/>
+    <w:lsdException w:name="Bibliography" w:semiHidden="1" w:uiPriority="37" w:unhideWhenUsed="1"/>
+    <w:lsdException w:name="TOC Heading" w:semiHidden="1" w:uiPriority="39" w:unhideWhenUsed="1" w:qFormat="1"/>
     <w:lsdException w:name="Plain Table 1" w:uiPriority="41"/>
     <w:lsdException w:name="Plain Table 2" w:uiPriority="42"/>
     <w:lsdException w:name="Plain Table 3" w:uiPriority="43"/>
@@ -2412,7 +2493,7 @@
     <w:lsdException w:name="Unresolved Mention" w:semiHidden="1" w:unhideWhenUsed="1"/>
     <w:lsdException w:name="Smart Link" w:semiHidden="1" w:unhideWhenUsed="1"/>
   </w:latentStyles>
-  <w:style w:type="paragraph" w:styleId="Normal" w:default="1">
+  <w:style w:type="paragraph" w:default="1" w:styleId="Standaard">
     <w:name w:val="Normal"/>
     <w:qFormat/>
     <w:rsid w:val="00C22F06"/>
@@ -2420,16 +2501,16 @@
       <w:spacing w:line="259" w:lineRule="auto"/>
     </w:pPr>
     <w:rPr>
-      <w:rFonts w:ascii="Arial" w:hAnsi="Arial" w:eastAsia="Arial" w:cs="Arial"/>
+      <w:rFonts w:ascii="Arial" w:eastAsia="Arial" w:hAnsi="Arial" w:cs="Arial"/>
       <w:sz w:val="22"/>
       <w:szCs w:val="22"/>
     </w:rPr>
   </w:style>
-  <w:style w:type="paragraph" w:styleId="Heading1">
+  <w:style w:type="paragraph" w:styleId="Kop1">
     <w:name w:val="heading 1"/>
-    <w:basedOn w:val="Normal"/>
-    <w:next w:val="Normal"/>
-    <w:link w:val="Heading1Char"/>
+    <w:basedOn w:val="Standaard"/>
+    <w:next w:val="Standaard"/>
+    <w:link w:val="Kop1Char"/>
     <w:uiPriority w:val="9"/>
     <w:qFormat/>
     <w:rsid w:val="003539DF"/>
@@ -2440,17 +2521,17 @@
       <w:outlineLvl w:val="0"/>
     </w:pPr>
     <w:rPr>
-      <w:rFonts w:asciiTheme="majorHAnsi" w:hAnsiTheme="majorHAnsi" w:eastAsiaTheme="majorEastAsia" w:cstheme="majorBidi"/>
+      <w:rFonts w:asciiTheme="majorHAnsi" w:eastAsiaTheme="majorEastAsia" w:hAnsiTheme="majorHAnsi" w:cstheme="majorBidi"/>
       <w:color w:val="0F4761" w:themeColor="accent1" w:themeShade="BF"/>
       <w:sz w:val="40"/>
       <w:szCs w:val="40"/>
     </w:rPr>
   </w:style>
-  <w:style w:type="paragraph" w:styleId="Heading2">
+  <w:style w:type="paragraph" w:styleId="Kop2">
     <w:name w:val="heading 2"/>
-    <w:basedOn w:val="Normal"/>
-    <w:next w:val="Normal"/>
-    <w:link w:val="Heading2Char"/>
+    <w:basedOn w:val="Standaard"/>
+    <w:next w:val="Standaard"/>
+    <w:link w:val="Kop2Char"/>
     <w:uiPriority w:val="9"/>
     <w:semiHidden/>
     <w:unhideWhenUsed/>
@@ -2463,17 +2544,17 @@
       <w:outlineLvl w:val="1"/>
     </w:pPr>
     <w:rPr>
-      <w:rFonts w:asciiTheme="majorHAnsi" w:hAnsiTheme="majorHAnsi" w:eastAsiaTheme="majorEastAsia" w:cstheme="majorBidi"/>
+      <w:rFonts w:asciiTheme="majorHAnsi" w:eastAsiaTheme="majorEastAsia" w:hAnsiTheme="majorHAnsi" w:cstheme="majorBidi"/>
       <w:color w:val="0F4761" w:themeColor="accent1" w:themeShade="BF"/>
       <w:sz w:val="32"/>
       <w:szCs w:val="32"/>
     </w:rPr>
   </w:style>
-  <w:style w:type="paragraph" w:styleId="Heading3">
+  <w:style w:type="paragraph" w:styleId="Kop3">
     <w:name w:val="heading 3"/>
-    <w:basedOn w:val="Normal"/>
-    <w:next w:val="Normal"/>
-    <w:link w:val="Heading3Char"/>
+    <w:basedOn w:val="Standaard"/>
+    <w:next w:val="Standaard"/>
+    <w:link w:val="Kop3Char"/>
     <w:uiPriority w:val="9"/>
     <w:semiHidden/>
     <w:unhideWhenUsed/>
@@ -2492,11 +2573,11 @@
       <w:szCs w:val="28"/>
     </w:rPr>
   </w:style>
-  <w:style w:type="paragraph" w:styleId="Heading4">
+  <w:style w:type="paragraph" w:styleId="Kop4">
     <w:name w:val="heading 4"/>
-    <w:basedOn w:val="Normal"/>
-    <w:next w:val="Normal"/>
-    <w:link w:val="Heading4Char"/>
+    <w:basedOn w:val="Standaard"/>
+    <w:next w:val="Standaard"/>
+    <w:link w:val="Kop4Char"/>
     <w:uiPriority w:val="9"/>
     <w:semiHidden/>
     <w:unhideWhenUsed/>
@@ -2515,11 +2596,11 @@
       <w:color w:val="0F4761" w:themeColor="accent1" w:themeShade="BF"/>
     </w:rPr>
   </w:style>
-  <w:style w:type="paragraph" w:styleId="Heading5">
+  <w:style w:type="paragraph" w:styleId="Kop5">
     <w:name w:val="heading 5"/>
-    <w:basedOn w:val="Normal"/>
-    <w:next w:val="Normal"/>
-    <w:link w:val="Heading5Char"/>
+    <w:basedOn w:val="Standaard"/>
+    <w:next w:val="Standaard"/>
+    <w:link w:val="Kop5Char"/>
     <w:uiPriority w:val="9"/>
     <w:semiHidden/>
     <w:unhideWhenUsed/>
@@ -2536,11 +2617,11 @@
       <w:color w:val="0F4761" w:themeColor="accent1" w:themeShade="BF"/>
     </w:rPr>
   </w:style>
-  <w:style w:type="paragraph" w:styleId="Heading6">
+  <w:style w:type="paragraph" w:styleId="Kop6">
     <w:name w:val="heading 6"/>
-    <w:basedOn w:val="Normal"/>
-    <w:next w:val="Normal"/>
-    <w:link w:val="Heading6Char"/>
+    <w:basedOn w:val="Standaard"/>
+    <w:next w:val="Standaard"/>
+    <w:link w:val="Kop6Char"/>
     <w:uiPriority w:val="9"/>
     <w:semiHidden/>
     <w:unhideWhenUsed/>
@@ -2559,11 +2640,11 @@
       <w:color w:val="595959" w:themeColor="text1" w:themeTint="A6"/>
     </w:rPr>
   </w:style>
-  <w:style w:type="paragraph" w:styleId="Heading7">
+  <w:style w:type="paragraph" w:styleId="Kop7">
     <w:name w:val="heading 7"/>
-    <w:basedOn w:val="Normal"/>
-    <w:next w:val="Normal"/>
-    <w:link w:val="Heading7Char"/>
+    <w:basedOn w:val="Standaard"/>
+    <w:next w:val="Standaard"/>
+    <w:link w:val="Kop7Char"/>
     <w:uiPriority w:val="9"/>
     <w:semiHidden/>
     <w:unhideWhenUsed/>
@@ -2580,11 +2661,11 @@
       <w:color w:val="595959" w:themeColor="text1" w:themeTint="A6"/>
     </w:rPr>
   </w:style>
-  <w:style w:type="paragraph" w:styleId="Heading8">
+  <w:style w:type="paragraph" w:styleId="Kop8">
     <w:name w:val="heading 8"/>
-    <w:basedOn w:val="Normal"/>
-    <w:next w:val="Normal"/>
-    <w:link w:val="Heading8Char"/>
+    <w:basedOn w:val="Standaard"/>
+    <w:next w:val="Standaard"/>
+    <w:link w:val="Kop8Char"/>
     <w:uiPriority w:val="9"/>
     <w:semiHidden/>
     <w:unhideWhenUsed/>
@@ -2603,11 +2684,11 @@
       <w:color w:val="272727" w:themeColor="text1" w:themeTint="D8"/>
     </w:rPr>
   </w:style>
-  <w:style w:type="paragraph" w:styleId="Heading9">
+  <w:style w:type="paragraph" w:styleId="Kop9">
     <w:name w:val="heading 9"/>
-    <w:basedOn w:val="Normal"/>
-    <w:next w:val="Normal"/>
-    <w:link w:val="Heading9Char"/>
+    <w:basedOn w:val="Standaard"/>
+    <w:next w:val="Standaard"/>
+    <w:link w:val="Kop9Char"/>
     <w:uiPriority w:val="9"/>
     <w:semiHidden/>
     <w:unhideWhenUsed/>
@@ -2624,13 +2705,13 @@
       <w:color w:val="272727" w:themeColor="text1" w:themeTint="D8"/>
     </w:rPr>
   </w:style>
-  <w:style w:type="character" w:styleId="DefaultParagraphFont" w:default="1">
+  <w:style w:type="character" w:default="1" w:styleId="Standaardalinea-lettertype">
     <w:name w:val="Default Paragraph Font"/>
     <w:uiPriority w:val="1"/>
     <w:semiHidden/>
     <w:unhideWhenUsed/>
   </w:style>
-  <w:style w:type="table" w:styleId="TableNormal" w:default="1">
+  <w:style w:type="table" w:default="1" w:styleId="Standaardtabel">
     <w:name w:val="Normal Table"/>
     <w:uiPriority w:val="99"/>
     <w:semiHidden/>
@@ -2645,43 +2726,43 @@
       </w:tblCellMar>
     </w:tblPr>
   </w:style>
-  <w:style w:type="numbering" w:styleId="NoList" w:default="1">
+  <w:style w:type="numbering" w:default="1" w:styleId="Geenlijst">
     <w:name w:val="No List"/>
     <w:uiPriority w:val="99"/>
     <w:semiHidden/>
     <w:unhideWhenUsed/>
   </w:style>
-  <w:style w:type="character" w:styleId="Heading1Char" w:customStyle="1">
-    <w:name w:val="Heading 1 Char"/>
-    <w:basedOn w:val="DefaultParagraphFont"/>
-    <w:link w:val="Heading1"/>
+  <w:style w:type="character" w:customStyle="1" w:styleId="Kop1Char">
+    <w:name w:val="Kop 1 Char"/>
+    <w:basedOn w:val="Standaardalinea-lettertype"/>
+    <w:link w:val="Kop1"/>
     <w:uiPriority w:val="9"/>
     <w:rsid w:val="003539DF"/>
     <w:rPr>
-      <w:rFonts w:asciiTheme="majorHAnsi" w:hAnsiTheme="majorHAnsi" w:eastAsiaTheme="majorEastAsia" w:cstheme="majorBidi"/>
+      <w:rFonts w:asciiTheme="majorHAnsi" w:eastAsiaTheme="majorEastAsia" w:hAnsiTheme="majorHAnsi" w:cstheme="majorBidi"/>
       <w:color w:val="0F4761" w:themeColor="accent1" w:themeShade="BF"/>
       <w:sz w:val="40"/>
       <w:szCs w:val="40"/>
     </w:rPr>
   </w:style>
-  <w:style w:type="character" w:styleId="Heading2Char" w:customStyle="1">
-    <w:name w:val="Heading 2 Char"/>
-    <w:basedOn w:val="DefaultParagraphFont"/>
-    <w:link w:val="Heading2"/>
+  <w:style w:type="character" w:customStyle="1" w:styleId="Kop2Char">
+    <w:name w:val="Kop 2 Char"/>
+    <w:basedOn w:val="Standaardalinea-lettertype"/>
+    <w:link w:val="Kop2"/>
     <w:uiPriority w:val="9"/>
     <w:semiHidden/>
     <w:rsid w:val="003539DF"/>
     <w:rPr>
-      <w:rFonts w:asciiTheme="majorHAnsi" w:hAnsiTheme="majorHAnsi" w:eastAsiaTheme="majorEastAsia" w:cstheme="majorBidi"/>
+      <w:rFonts w:asciiTheme="majorHAnsi" w:eastAsiaTheme="majorEastAsia" w:hAnsiTheme="majorHAnsi" w:cstheme="majorBidi"/>
       <w:color w:val="0F4761" w:themeColor="accent1" w:themeShade="BF"/>
       <w:sz w:val="32"/>
       <w:szCs w:val="32"/>
     </w:rPr>
   </w:style>
-  <w:style w:type="character" w:styleId="Heading3Char" w:customStyle="1">
-    <w:name w:val="Heading 3 Char"/>
-    <w:basedOn w:val="DefaultParagraphFont"/>
-    <w:link w:val="Heading3"/>
+  <w:style w:type="character" w:customStyle="1" w:styleId="Kop3Char">
+    <w:name w:val="Kop 3 Char"/>
+    <w:basedOn w:val="Standaardalinea-lettertype"/>
+    <w:link w:val="Kop3"/>
     <w:uiPriority w:val="9"/>
     <w:semiHidden/>
     <w:rsid w:val="003539DF"/>
@@ -2692,10 +2773,10 @@
       <w:szCs w:val="28"/>
     </w:rPr>
   </w:style>
-  <w:style w:type="character" w:styleId="Heading4Char" w:customStyle="1">
-    <w:name w:val="Heading 4 Char"/>
-    <w:basedOn w:val="DefaultParagraphFont"/>
-    <w:link w:val="Heading4"/>
+  <w:style w:type="character" w:customStyle="1" w:styleId="Kop4Char">
+    <w:name w:val="Kop 4 Char"/>
+    <w:basedOn w:val="Standaardalinea-lettertype"/>
+    <w:link w:val="Kop4"/>
     <w:uiPriority w:val="9"/>
     <w:semiHidden/>
     <w:rsid w:val="003539DF"/>
@@ -2706,10 +2787,10 @@
       <w:color w:val="0F4761" w:themeColor="accent1" w:themeShade="BF"/>
     </w:rPr>
   </w:style>
-  <w:style w:type="character" w:styleId="Heading5Char" w:customStyle="1">
-    <w:name w:val="Heading 5 Char"/>
-    <w:basedOn w:val="DefaultParagraphFont"/>
-    <w:link w:val="Heading5"/>
+  <w:style w:type="character" w:customStyle="1" w:styleId="Kop5Char">
+    <w:name w:val="Kop 5 Char"/>
+    <w:basedOn w:val="Standaardalinea-lettertype"/>
+    <w:link w:val="Kop5"/>
     <w:uiPriority w:val="9"/>
     <w:semiHidden/>
     <w:rsid w:val="003539DF"/>
@@ -2718,10 +2799,10 @@
       <w:color w:val="0F4761" w:themeColor="accent1" w:themeShade="BF"/>
     </w:rPr>
   </w:style>
-  <w:style w:type="character" w:styleId="Heading6Char" w:customStyle="1">
-    <w:name w:val="Heading 6 Char"/>
-    <w:basedOn w:val="DefaultParagraphFont"/>
-    <w:link w:val="Heading6"/>
+  <w:style w:type="character" w:customStyle="1" w:styleId="Kop6Char">
+    <w:name w:val="Kop 6 Char"/>
+    <w:basedOn w:val="Standaardalinea-lettertype"/>
+    <w:link w:val="Kop6"/>
     <w:uiPriority w:val="9"/>
     <w:semiHidden/>
     <w:rsid w:val="003539DF"/>
@@ -2732,10 +2813,10 @@
       <w:color w:val="595959" w:themeColor="text1" w:themeTint="A6"/>
     </w:rPr>
   </w:style>
-  <w:style w:type="character" w:styleId="Heading7Char" w:customStyle="1">
-    <w:name w:val="Heading 7 Char"/>
-    <w:basedOn w:val="DefaultParagraphFont"/>
-    <w:link w:val="Heading7"/>
+  <w:style w:type="character" w:customStyle="1" w:styleId="Kop7Char">
+    <w:name w:val="Kop 7 Char"/>
+    <w:basedOn w:val="Standaardalinea-lettertype"/>
+    <w:link w:val="Kop7"/>
     <w:uiPriority w:val="9"/>
     <w:semiHidden/>
     <w:rsid w:val="003539DF"/>
@@ -2744,10 +2825,10 @@
       <w:color w:val="595959" w:themeColor="text1" w:themeTint="A6"/>
     </w:rPr>
   </w:style>
-  <w:style w:type="character" w:styleId="Heading8Char" w:customStyle="1">
-    <w:name w:val="Heading 8 Char"/>
-    <w:basedOn w:val="DefaultParagraphFont"/>
-    <w:link w:val="Heading8"/>
+  <w:style w:type="character" w:customStyle="1" w:styleId="Kop8Char">
+    <w:name w:val="Kop 8 Char"/>
+    <w:basedOn w:val="Standaardalinea-lettertype"/>
+    <w:link w:val="Kop8"/>
     <w:uiPriority w:val="9"/>
     <w:semiHidden/>
     <w:rsid w:val="003539DF"/>
@@ -2758,10 +2839,10 @@
       <w:color w:val="272727" w:themeColor="text1" w:themeTint="D8"/>
     </w:rPr>
   </w:style>
-  <w:style w:type="character" w:styleId="Heading9Char" w:customStyle="1">
-    <w:name w:val="Heading 9 Char"/>
-    <w:basedOn w:val="DefaultParagraphFont"/>
-    <w:link w:val="Heading9"/>
+  <w:style w:type="character" w:customStyle="1" w:styleId="Kop9Char">
+    <w:name w:val="Kop 9 Char"/>
+    <w:basedOn w:val="Standaardalinea-lettertype"/>
+    <w:link w:val="Kop9"/>
     <w:uiPriority w:val="9"/>
     <w:semiHidden/>
     <w:rsid w:val="003539DF"/>
@@ -2770,11 +2851,11 @@
       <w:color w:val="272727" w:themeColor="text1" w:themeTint="D8"/>
     </w:rPr>
   </w:style>
-  <w:style w:type="paragraph" w:styleId="Title">
+  <w:style w:type="paragraph" w:styleId="Titel">
     <w:name w:val="Title"/>
-    <w:basedOn w:val="Normal"/>
-    <w:next w:val="Normal"/>
-    <w:link w:val="TitleChar"/>
+    <w:basedOn w:val="Standaard"/>
+    <w:next w:val="Standaard"/>
+    <w:link w:val="TitelChar"/>
     <w:uiPriority w:val="10"/>
     <w:qFormat/>
     <w:rsid w:val="003539DF"/>
@@ -2783,32 +2864,32 @@
       <w:contextualSpacing/>
     </w:pPr>
     <w:rPr>
-      <w:rFonts w:asciiTheme="majorHAnsi" w:hAnsiTheme="majorHAnsi" w:eastAsiaTheme="majorEastAsia" w:cstheme="majorBidi"/>
+      <w:rFonts w:asciiTheme="majorHAnsi" w:eastAsiaTheme="majorEastAsia" w:hAnsiTheme="majorHAnsi" w:cstheme="majorBidi"/>
       <w:spacing w:val="-10"/>
       <w:kern w:val="28"/>
       <w:sz w:val="56"/>
       <w:szCs w:val="56"/>
     </w:rPr>
   </w:style>
-  <w:style w:type="character" w:styleId="TitleChar" w:customStyle="1">
-    <w:name w:val="Title Char"/>
-    <w:basedOn w:val="DefaultParagraphFont"/>
-    <w:link w:val="Title"/>
+  <w:style w:type="character" w:customStyle="1" w:styleId="TitelChar">
+    <w:name w:val="Titel Char"/>
+    <w:basedOn w:val="Standaardalinea-lettertype"/>
+    <w:link w:val="Titel"/>
     <w:uiPriority w:val="10"/>
     <w:rsid w:val="003539DF"/>
     <w:rPr>
-      <w:rFonts w:asciiTheme="majorHAnsi" w:hAnsiTheme="majorHAnsi" w:eastAsiaTheme="majorEastAsia" w:cstheme="majorBidi"/>
+      <w:rFonts w:asciiTheme="majorHAnsi" w:eastAsiaTheme="majorEastAsia" w:hAnsiTheme="majorHAnsi" w:cstheme="majorBidi"/>
       <w:spacing w:val="-10"/>
       <w:kern w:val="28"/>
       <w:sz w:val="56"/>
       <w:szCs w:val="56"/>
     </w:rPr>
   </w:style>
-  <w:style w:type="paragraph" w:styleId="Subtitle">
+  <w:style w:type="paragraph" w:styleId="Ondertitel">
     <w:name w:val="Subtitle"/>
-    <w:basedOn w:val="Normal"/>
-    <w:next w:val="Normal"/>
-    <w:link w:val="SubtitleChar"/>
+    <w:basedOn w:val="Standaard"/>
+    <w:next w:val="Standaard"/>
+    <w:link w:val="OndertitelChar"/>
     <w:uiPriority w:val="11"/>
     <w:qFormat/>
     <w:rsid w:val="003539DF"/>
@@ -2825,10 +2906,10 @@
       <w:szCs w:val="28"/>
     </w:rPr>
   </w:style>
-  <w:style w:type="character" w:styleId="SubtitleChar" w:customStyle="1">
-    <w:name w:val="Subtitle Char"/>
-    <w:basedOn w:val="DefaultParagraphFont"/>
-    <w:link w:val="Subtitle"/>
+  <w:style w:type="character" w:customStyle="1" w:styleId="OndertitelChar">
+    <w:name w:val="Ondertitel Char"/>
+    <w:basedOn w:val="Standaardalinea-lettertype"/>
+    <w:link w:val="Ondertitel"/>
     <w:uiPriority w:val="11"/>
     <w:rsid w:val="003539DF"/>
     <w:rPr>
@@ -2839,11 +2920,11 @@
       <w:szCs w:val="28"/>
     </w:rPr>
   </w:style>
-  <w:style w:type="paragraph" w:styleId="Quote">
+  <w:style w:type="paragraph" w:styleId="Citaat">
     <w:name w:val="Quote"/>
-    <w:basedOn w:val="Normal"/>
-    <w:next w:val="Normal"/>
-    <w:link w:val="QuoteChar"/>
+    <w:basedOn w:val="Standaard"/>
+    <w:next w:val="Standaard"/>
+    <w:link w:val="CitaatChar"/>
     <w:uiPriority w:val="29"/>
     <w:qFormat/>
     <w:rsid w:val="003539DF"/>
@@ -2857,10 +2938,10 @@
       <w:color w:val="404040" w:themeColor="text1" w:themeTint="BF"/>
     </w:rPr>
   </w:style>
-  <w:style w:type="character" w:styleId="QuoteChar" w:customStyle="1">
-    <w:name w:val="Quote Char"/>
-    <w:basedOn w:val="DefaultParagraphFont"/>
-    <w:link w:val="Quote"/>
+  <w:style w:type="character" w:customStyle="1" w:styleId="CitaatChar">
+    <w:name w:val="Citaat Char"/>
+    <w:basedOn w:val="Standaardalinea-lettertype"/>
+    <w:link w:val="Citaat"/>
     <w:uiPriority w:val="29"/>
     <w:rsid w:val="003539DF"/>
     <w:rPr>
@@ -2869,10 +2950,10 @@
       <w:color w:val="404040" w:themeColor="text1" w:themeTint="BF"/>
     </w:rPr>
   </w:style>
-  <w:style w:type="paragraph" w:styleId="ListParagraph">
+  <w:style w:type="paragraph" w:styleId="Lijstalinea">
     <w:name w:val="List Paragraph"/>
-    <w:basedOn w:val="Normal"/>
-    <w:link w:val="ListParagraphChar"/>
+    <w:basedOn w:val="Standaard"/>
+    <w:link w:val="LijstalineaChar"/>
     <w:uiPriority w:val="34"/>
     <w:qFormat/>
     <w:rsid w:val="003539DF"/>
@@ -2881,9 +2962,9 @@
       <w:contextualSpacing/>
     </w:pPr>
   </w:style>
-  <w:style w:type="character" w:styleId="IntenseEmphasis">
+  <w:style w:type="character" w:styleId="Intensievebenadrukking">
     <w:name w:val="Intense Emphasis"/>
-    <w:basedOn w:val="DefaultParagraphFont"/>
+    <w:basedOn w:val="Standaardalinea-lettertype"/>
     <w:uiPriority w:val="21"/>
     <w:qFormat/>
     <w:rsid w:val="003539DF"/>
@@ -2893,18 +2974,18 @@
       <w:color w:val="0F4761" w:themeColor="accent1" w:themeShade="BF"/>
     </w:rPr>
   </w:style>
-  <w:style w:type="paragraph" w:styleId="IntenseQuote">
+  <w:style w:type="paragraph" w:styleId="Duidelijkcitaat">
     <w:name w:val="Intense Quote"/>
-    <w:basedOn w:val="Normal"/>
-    <w:next w:val="Normal"/>
-    <w:link w:val="IntenseQuoteChar"/>
+    <w:basedOn w:val="Standaard"/>
+    <w:next w:val="Standaard"/>
+    <w:link w:val="DuidelijkcitaatChar"/>
     <w:uiPriority w:val="30"/>
     <w:qFormat/>
     <w:rsid w:val="003539DF"/>
     <w:pPr>
       <w:pBdr>
-        <w:top w:val="single" w:color="0F4761" w:themeColor="accent1" w:themeShade="BF" w:sz="4" w:space="10"/>
-        <w:bottom w:val="single" w:color="0F4761" w:themeColor="accent1" w:themeShade="BF" w:sz="4" w:space="10"/>
+        <w:top w:val="single" w:sz="4" w:space="10" w:color="0F4761" w:themeColor="accent1" w:themeShade="BF"/>
+        <w:bottom w:val="single" w:sz="4" w:space="10" w:color="0F4761" w:themeColor="accent1" w:themeShade="BF"/>
       </w:pBdr>
       <w:spacing w:before="360" w:after="360"/>
       <w:ind w:left="864" w:right="864"/>
@@ -2916,10 +2997,10 @@
       <w:color w:val="0F4761" w:themeColor="accent1" w:themeShade="BF"/>
     </w:rPr>
   </w:style>
-  <w:style w:type="character" w:styleId="IntenseQuoteChar" w:customStyle="1">
-    <w:name w:val="Intense Quote Char"/>
-    <w:basedOn w:val="DefaultParagraphFont"/>
-    <w:link w:val="IntenseQuote"/>
+  <w:style w:type="character" w:customStyle="1" w:styleId="DuidelijkcitaatChar">
+    <w:name w:val="Duidelijk citaat Char"/>
+    <w:basedOn w:val="Standaardalinea-lettertype"/>
+    <w:link w:val="Duidelijkcitaat"/>
     <w:uiPriority w:val="30"/>
     <w:rsid w:val="003539DF"/>
     <w:rPr>
@@ -2928,9 +3009,9 @@
       <w:color w:val="0F4761" w:themeColor="accent1" w:themeShade="BF"/>
     </w:rPr>
   </w:style>
-  <w:style w:type="character" w:styleId="IntenseReference">
+  <w:style w:type="character" w:styleId="Intensieveverwijzing">
     <w:name w:val="Intense Reference"/>
-    <w:basedOn w:val="DefaultParagraphFont"/>
+    <w:basedOn w:val="Standaardalinea-lettertype"/>
     <w:uiPriority w:val="32"/>
     <w:qFormat/>
     <w:rsid w:val="003539DF"/>
@@ -2942,17 +3023,17 @@
       <w:spacing w:val="5"/>
     </w:rPr>
   </w:style>
-  <w:style w:type="character" w:styleId="ListParagraphChar" w:customStyle="1">
-    <w:name w:val="List Paragraph Char"/>
-    <w:basedOn w:val="DefaultParagraphFont"/>
-    <w:link w:val="ListParagraph"/>
+  <w:style w:type="character" w:customStyle="1" w:styleId="LijstalineaChar">
+    <w:name w:val="Lijstalinea Char"/>
+    <w:basedOn w:val="Standaardalinea-lettertype"/>
+    <w:link w:val="Lijstalinea"/>
     <w:uiPriority w:val="34"/>
     <w:qFormat/>
     <w:rsid w:val="00C22F06"/>
   </w:style>
-  <w:style w:type="table" w:styleId="TableGrid">
+  <w:style w:type="table" w:styleId="Tabelraster">
     <w:name w:val="Table Grid"/>
-    <w:basedOn w:val="TableNormal"/>
+    <w:basedOn w:val="Standaardtabel"/>
     <w:uiPriority w:val="39"/>
     <w:rsid w:val="00C22F06"/>
     <w:pPr>
@@ -2964,19 +3045,19 @@
     </w:rPr>
     <w:tblPr>
       <w:tblBorders>
-        <w:top w:val="single" w:color="auto" w:sz="4" w:space="0"/>
-        <w:left w:val="single" w:color="auto" w:sz="4" w:space="0"/>
-        <w:bottom w:val="single" w:color="auto" w:sz="4" w:space="0"/>
-        <w:right w:val="single" w:color="auto" w:sz="4" w:space="0"/>
-        <w:insideH w:val="single" w:color="auto" w:sz="4" w:space="0"/>
-        <w:insideV w:val="single" w:color="auto" w:sz="4" w:space="0"/>
+        <w:top w:val="single" w:sz="4" w:space="0" w:color="auto"/>
+        <w:left w:val="single" w:sz="4" w:space="0" w:color="auto"/>
+        <w:bottom w:val="single" w:sz="4" w:space="0" w:color="auto"/>
+        <w:right w:val="single" w:sz="4" w:space="0" w:color="auto"/>
+        <w:insideH w:val="single" w:sz="4" w:space="0" w:color="auto"/>
+        <w:insideV w:val="single" w:sz="4" w:space="0" w:color="auto"/>
       </w:tblBorders>
     </w:tblPr>
   </w:style>
-  <w:style w:type="paragraph" w:styleId="Header">
+  <w:style w:type="paragraph" w:styleId="Koptekst">
     <w:name w:val="header"/>
-    <w:basedOn w:val="Normal"/>
-    <w:link w:val="HeaderChar"/>
+    <w:basedOn w:val="Standaard"/>
+    <w:link w:val="KoptekstChar"/>
     <w:uiPriority w:val="99"/>
     <w:unhideWhenUsed/>
     <w:rsid w:val="00F65961"/>
@@ -2988,10 +3069,10 @@
       <w:spacing w:after="0" w:line="240" w:lineRule="auto"/>
     </w:pPr>
   </w:style>
-  <w:style w:type="character" w:styleId="HeaderChar" w:customStyle="1">
-    <w:name w:val="Header Char"/>
-    <w:basedOn w:val="DefaultParagraphFont"/>
-    <w:link w:val="Header"/>
+  <w:style w:type="character" w:customStyle="1" w:styleId="KoptekstChar">
+    <w:name w:val="Koptekst Char"/>
+    <w:basedOn w:val="Standaardalinea-lettertype"/>
+    <w:link w:val="Koptekst"/>
     <w:uiPriority w:val="99"/>
     <w:rsid w:val="00F65961"/>
     <w:rPr>
@@ -3000,10 +3081,10 @@
       <w:lang w:val="en-GB"/>
     </w:rPr>
   </w:style>
-  <w:style w:type="paragraph" w:styleId="Footer">
+  <w:style w:type="paragraph" w:styleId="Voettekst">
     <w:name w:val="footer"/>
-    <w:basedOn w:val="Normal"/>
-    <w:link w:val="FooterChar"/>
+    <w:basedOn w:val="Standaard"/>
+    <w:link w:val="VoettekstChar"/>
     <w:uiPriority w:val="99"/>
     <w:unhideWhenUsed/>
     <w:rsid w:val="00F65961"/>
@@ -3015,10 +3096,10 @@
       <w:spacing w:after="0" w:line="240" w:lineRule="auto"/>
     </w:pPr>
   </w:style>
-  <w:style w:type="character" w:styleId="FooterChar" w:customStyle="1">
-    <w:name w:val="Footer Char"/>
-    <w:basedOn w:val="DefaultParagraphFont"/>
-    <w:link w:val="Footer"/>
+  <w:style w:type="character" w:customStyle="1" w:styleId="VoettekstChar">
+    <w:name w:val="Voettekst Char"/>
+    <w:basedOn w:val="Standaardalinea-lettertype"/>
+    <w:link w:val="Voettekst"/>
     <w:uiPriority w:val="99"/>
     <w:rsid w:val="00F65961"/>
     <w:rPr>
@@ -3027,9 +3108,9 @@
       <w:lang w:val="en-GB"/>
     </w:rPr>
   </w:style>
-  <w:style w:type="character" w:styleId="CommentReference">
+  <w:style w:type="character" w:customStyle="1" w:styleId="CommentReference">
     <w:name w:val="Comment Reference"/>
-    <w:basedOn w:val="DefaultParagraphFont"/>
+    <w:basedOn w:val="Standaardalinea-lettertype"/>
     <w:uiPriority w:val="99"/>
     <w:semiHidden/>
     <w:unhideWhenUsed/>
@@ -3039,9 +3120,9 @@
       <w:szCs w:val="16"/>
     </w:rPr>
   </w:style>
-  <w:style w:type="paragraph" w:styleId="CommentText">
+  <w:style w:type="paragraph" w:customStyle="1" w:styleId="CommentText">
     <w:name w:val="Comment Text"/>
-    <w:basedOn w:val="Normal"/>
+    <w:basedOn w:val="Standaard"/>
     <w:link w:val="CommentTextChar"/>
     <w:uiPriority w:val="99"/>
     <w:unhideWhenUsed/>
@@ -3055,9 +3136,9 @@
       <w:lang w:val="en-GB"/>
     </w:rPr>
   </w:style>
-  <w:style w:type="character" w:styleId="CommentTextChar" w:customStyle="1">
+  <w:style w:type="character" w:customStyle="1" w:styleId="CommentTextChar">
     <w:name w:val="Comment Text Char"/>
-    <w:basedOn w:val="DefaultParagraphFont"/>
+    <w:basedOn w:val="Standaardalinea-lettertype"/>
     <w:link w:val="CommentText"/>
     <w:uiPriority w:val="99"/>
     <w:rsid w:val="002C3698"/>
@@ -3067,11 +3148,26 @@
       <w:lang w:val="en-GB"/>
     </w:rPr>
   </w:style>
+  <w:style w:type="paragraph" w:styleId="Revisie">
+    <w:name w:val="Revision"/>
+    <w:hidden/>
+    <w:uiPriority w:val="99"/>
+    <w:semiHidden/>
+    <w:rsid w:val="00E73476"/>
+    <w:pPr>
+      <w:spacing w:after="0" w:line="240" w:lineRule="auto"/>
+    </w:pPr>
+    <w:rPr>
+      <w:rFonts w:ascii="Arial" w:eastAsia="Arial" w:hAnsi="Arial" w:cs="Arial"/>
+      <w:sz w:val="22"/>
+      <w:szCs w:val="22"/>
+    </w:rPr>
+  </w:style>
 </w:styles>
 </file>
 
 <file path=word/theme/theme1.xml><?xml version="1.0" encoding="utf-8"?>
-<a:theme xmlns:a="http://schemas.openxmlformats.org/drawingml/2006/main" xmlns:thm15="http://schemas.microsoft.com/office/thememl/2012/main" name="Office Theme">
+<a:theme xmlns:a="http://schemas.openxmlformats.org/drawingml/2006/main" name="Office Theme">
   <a:themeElements>
     <a:clrScheme name="Office">
       <a:dk1>
@@ -3386,6 +3482,21 @@
 </file>
 
 <file path=customXml/item1.xml><?xml version="1.0" encoding="utf-8"?>
+<p:properties xmlns:p="http://schemas.microsoft.com/office/2006/metadata/properties" xmlns:xsi="http://www.w3.org/2001/XMLSchema-instance" xmlns:pc="http://schemas.microsoft.com/office/infopath/2007/PartnerControls">
+  <documentManagement/>
+</p:properties>
+</file>
+
+<file path=customXml/item2.xml><?xml version="1.0" encoding="utf-8"?>
+<?mso-contentType ?>
+<FormTemplates xmlns="http://schemas.microsoft.com/sharepoint/v3/contenttype/forms">
+  <Display>DocumentLibraryForm</Display>
+  <Edit>DocumentLibraryForm</Edit>
+  <New>DocumentLibraryForm</New>
+</FormTemplates>
+</file>
+
+<file path=customXml/item3.xml><?xml version="1.0" encoding="utf-8"?>
 <ct:contentTypeSchema xmlns:ct="http://schemas.microsoft.com/office/2006/metadata/contentType" xmlns:ma="http://schemas.microsoft.com/office/2006/metadata/properties/metaAttributes" ct:_="" ma:_="" ma:contentTypeName="Document" ma:contentTypeID="0x010100F1B33D7B57FFEC4BB77B5001C5B93838" ma:contentTypeVersion="6" ma:contentTypeDescription="Een nieuw document maken." ma:contentTypeScope="" ma:versionID="59579db12405a868ad0e92c5e4f74ae1">
   <xsd:schema xmlns:xsd="http://www.w3.org/2001/XMLSchema" xmlns:xs="http://www.w3.org/2001/XMLSchema" xmlns:p="http://schemas.microsoft.com/office/2006/metadata/properties" xmlns:ns2="f44e6bd5-09db-4117-8b15-adf399208dc6" targetNamespace="http://schemas.microsoft.com/office/2006/metadata/properties" ma:root="true" ma:fieldsID="98cf673e6ff17a9b7a889e3f7df574b2" ns2:_="">
     <xsd:import namespace="f44e6bd5-09db-4117-8b15-adf399208dc6"/>
@@ -3541,29 +3652,37 @@
 </ct:contentTypeSchema>
 </file>
 
-<file path=customXml/item2.xml><?xml version="1.0" encoding="utf-8"?>
-<?mso-contentType ?>
-<FormTemplates xmlns="http://schemas.microsoft.com/sharepoint/v3/contenttype/forms">
-  <Display>DocumentLibraryForm</Display>
-  <Edit>DocumentLibraryForm</Edit>
-  <New>DocumentLibraryForm</New>
-</FormTemplates>
-</file>
-
-<file path=customXml/item3.xml><?xml version="1.0" encoding="utf-8"?>
-<p:properties xmlns:p="http://schemas.microsoft.com/office/2006/metadata/properties" xmlns:xsi="http://www.w3.org/2001/XMLSchema-instance" xmlns:pc="http://schemas.microsoft.com/office/infopath/2007/PartnerControls">
-  <documentManagement/>
-</p:properties>
-</file>
-
 <file path=customXml/itemProps1.xml><?xml version="1.0" encoding="utf-8"?>
-<ds:datastoreItem xmlns:ds="http://schemas.openxmlformats.org/officeDocument/2006/customXml" ds:itemID="{7B36E412-16E7-4980-96FD-72FA6FEC53FA}"/>
+<ds:datastoreItem xmlns:ds="http://schemas.openxmlformats.org/officeDocument/2006/customXml" ds:itemID="{59FBABC5-65D4-4473-8F42-EB0F9F34F51F}">
+  <ds:schemaRefs>
+    <ds:schemaRef ds:uri="http://schemas.microsoft.com/office/2006/metadata/properties"/>
+    <ds:schemaRef ds:uri="http://schemas.microsoft.com/office/infopath/2007/PartnerControls"/>
+  </ds:schemaRefs>
+</ds:datastoreItem>
 </file>
 
 <file path=customXml/itemProps2.xml><?xml version="1.0" encoding="utf-8"?>
-<ds:datastoreItem xmlns:ds="http://schemas.openxmlformats.org/officeDocument/2006/customXml" ds:itemID="{E63B1017-2742-4415-A24D-065BA591908D}"/>
+<ds:datastoreItem xmlns:ds="http://schemas.openxmlformats.org/officeDocument/2006/customXml" ds:itemID="{E63B1017-2742-4415-A24D-065BA591908D}">
+  <ds:schemaRefs>
+    <ds:schemaRef ds:uri="http://schemas.microsoft.com/sharepoint/v3/contenttype/forms"/>
+  </ds:schemaRefs>
+</ds:datastoreItem>
 </file>
 
 <file path=customXml/itemProps3.xml><?xml version="1.0" encoding="utf-8"?>
-<ds:datastoreItem xmlns:ds="http://schemas.openxmlformats.org/officeDocument/2006/customXml" ds:itemID="{59FBABC5-65D4-4473-8F42-EB0F9F34F51F}"/>
+<ds:datastoreItem xmlns:ds="http://schemas.openxmlformats.org/officeDocument/2006/customXml" ds:itemID="{7B36E412-16E7-4980-96FD-72FA6FEC53FA}">
+  <ds:schemaRefs>
+    <ds:schemaRef ds:uri="http://schemas.microsoft.com/office/2006/metadata/contentType"/>
+    <ds:schemaRef ds:uri="http://schemas.microsoft.com/office/2006/metadata/properties/metaAttributes"/>
+    <ds:schemaRef ds:uri="http://www.w3.org/2001/XMLSchema"/>
+    <ds:schemaRef ds:uri="http://schemas.microsoft.com/office/2006/metadata/properties"/>
+    <ds:schemaRef ds:uri="f44e6bd5-09db-4117-8b15-adf399208dc6"/>
+    <ds:schemaRef ds:uri="http://schemas.microsoft.com/office/2006/documentManagement/types"/>
+    <ds:schemaRef ds:uri="http://schemas.microsoft.com/office/infopath/2007/PartnerControls"/>
+    <ds:schemaRef ds:uri="http://schemas.openxmlformats.org/package/2006/metadata/core-properties"/>
+    <ds:schemaRef ds:uri="http://purl.org/dc/elements/1.1/"/>
+    <ds:schemaRef ds:uri="http://purl.org/dc/terms/"/>
+    <ds:schemaRef ds:uri="http://schemas.microsoft.com/internal/obd"/>
+  </ds:schemaRefs>
+</ds:datastoreItem>
 </file>
</xml_diff>